<commit_message>
Multi-client server, bursty cross-traffic proxy and eval, polite-mode sweep, docs updated
Co-Authored-By: Claude Sonnet 5.5 <noreply@anthropic.com>
Claude-Session: https://claude.ai/code/session_01NX2zRNpdVAnzFNKmqomzKu
</commit_message>
<xml_diff>
--- a/docs/RUDP_Final_Project_Report.docx
+++ b/docs/RUDP_Final_Project_Report.docx
@@ -29949,6 +29949,2443 @@
     </w:p>
     <w:p>
       <w:pPr>
+        <w:pStyle w:val="Heading2"/>
+        <w:keepNext/>
+        <w:spacing w:after="120" w:before="120" w:line="360"/>
+      </w:pPr>
+      <w:r>
+        <w:rPr>
+          <w:rFonts w:ascii="Times New Roman" w:cs="Times New Roman" w:eastAsia="Times New Roman" w:hAnsi="Times New Roman"/>
+          <w:b/>
+          <w:bCs/>
+          <w:sz w:val="24"/>
+          <w:szCs w:val="24"/>
+        </w:rPr>
+        <w:t xml:space="preserve">8.15 A fairer neighbour, bursty cross traffic, and a multi-client server</w:t>
+      </w:r>
+    </w:p>
+    <w:p>
+      <w:pPr>
+        <w:spacing w:after="120" w:line="360"/>
+        <w:jc w:val="both"/>
+      </w:pPr>
+      <w:r>
+        <w:rPr>
+          <w:rFonts w:ascii="Times New Roman" w:cs="Times New Roman" w:eastAsia="Times New Roman" w:hAnsi="Times New Roman"/>
+          <w:sz w:val="24"/>
+          <w:szCs w:val="24"/>
+        </w:rPr>
+        <w:t xml:space="preserve">Three of the limitations listed in the previous version of this report were worked on. </w:t>
+      </w:r>
+      <w:r>
+        <w:rPr>
+          <w:rFonts w:ascii="Times New Roman" w:cs="Times New Roman" w:eastAsia="Times New Roman" w:hAnsi="Times New Roman"/>
+          <w:b/>
+          <w:bCs/>
+          <w:sz w:val="24"/>
+          <w:szCs w:val="24"/>
+        </w:rPr>
+        <w:t xml:space="preserve">Fairness.</w:t>
+      </w:r>
+      <w:r>
+        <w:rPr>
+          <w:rFonts w:ascii="Times New Roman" w:cs="Times New Roman" w:eastAsia="Times New Roman" w:hAnsi="Times New Roman"/>
+          <w:sz w:val="24"/>
+          <w:szCs w:val="24"/>
+        </w:rPr>
+        <w:t xml:space="preserve"> The agent has an optional polite mode (smart_client --polite X): when the round-trip ratio is at least X and the queueing delay is larger than twice the measured RTT deviation (so that jitter is not mistaken for a queue) and the window is above 12 packets, the agent backs off by a factor of 0.85 instead of following the network. Two flows, the neural agent against tuned AIMD, were run through the shared-bottleneck proxy, 8 runs per setting.</w:t>
+      </w:r>
+    </w:p>
+    <w:tbl>
+      <w:tblPr>
+        <w:tblW w:type="dxa" w:w="9026"/>
+        <w:tblBorders>
+          <w:top w:val="single" w:color="auto" w:sz="4"/>
+          <w:left w:val="single" w:color="auto" w:sz="4"/>
+          <w:bottom w:val="single" w:color="auto" w:sz="4"/>
+          <w:right w:val="single" w:color="auto" w:sz="4"/>
+          <w:insideH w:val="single" w:color="auto" w:sz="4"/>
+          <w:insideV w:val="single" w:color="auto" w:sz="4"/>
+        </w:tblBorders>
+      </w:tblPr>
+      <w:tblGrid>
+        <w:gridCol w:w="2800"/>
+        <w:gridCol w:w="1200"/>
+        <w:gridCol w:w="1100"/>
+        <w:gridCol w:w="1300"/>
+        <w:gridCol w:w="1300"/>
+        <w:gridCol w:w="1326"/>
+      </w:tblGrid>
+      <w:tr>
+        <w:trPr>
+          <w:cantSplit/>
+          <w:tblHeader/>
+        </w:trPr>
+        <w:tc>
+          <w:tcPr>
+            <w:tcW w:type="dxa" w:w="2800"/>
+            <w:tcBorders>
+              <w:top w:val="single" w:color="000000" w:sz="4"/>
+              <w:left w:val="single" w:color="000000" w:sz="4"/>
+              <w:bottom w:val="single" w:color="000000" w:sz="4"/>
+              <w:right w:val="single" w:color="000000" w:sz="4"/>
+            </w:tcBorders>
+            <w:shd w:fill="D9D9D9" w:color="auto" w:val="clear"/>
+            <w:tcMar>
+              <w:top w:type="dxa" w:w="60"/>
+              <w:left w:type="dxa" w:w="100"/>
+              <w:bottom w:type="dxa" w:w="60"/>
+              <w:right w:type="dxa" w:w="100"/>
+            </w:tcMar>
+          </w:tcPr>
+          <w:p>
+            <w:pPr>
+              <w:spacing w:line="276"/>
+              <w:jc w:val="left"/>
+            </w:pPr>
+            <w:r>
+              <w:rPr>
+                <w:rFonts w:ascii="Times New Roman" w:cs="Times New Roman" w:eastAsia="Times New Roman" w:hAnsi="Times New Roman"/>
+                <w:b/>
+                <w:bCs/>
+                <w:sz w:val="24"/>
+                <w:szCs w:val="24"/>
+              </w:rPr>
+              <w:t xml:space="preserve">Setting</w:t>
+            </w:r>
+          </w:p>
+        </w:tc>
+        <w:tc>
+          <w:tcPr>
+            <w:tcW w:type="dxa" w:w="1200"/>
+            <w:tcBorders>
+              <w:top w:val="single" w:color="000000" w:sz="4"/>
+              <w:left w:val="single" w:color="000000" w:sz="4"/>
+              <w:bottom w:val="single" w:color="000000" w:sz="4"/>
+              <w:right w:val="single" w:color="000000" w:sz="4"/>
+            </w:tcBorders>
+            <w:shd w:fill="D9D9D9" w:color="auto" w:val="clear"/>
+            <w:tcMar>
+              <w:top w:type="dxa" w:w="60"/>
+              <w:left w:type="dxa" w:w="100"/>
+              <w:bottom w:type="dxa" w:w="60"/>
+              <w:right w:type="dxa" w:w="100"/>
+            </w:tcMar>
+          </w:tcPr>
+          <w:p>
+            <w:pPr>
+              <w:spacing w:line="276"/>
+              <w:jc w:val="left"/>
+            </w:pPr>
+            <w:r>
+              <w:rPr>
+                <w:rFonts w:ascii="Times New Roman" w:cs="Times New Roman" w:eastAsia="Times New Roman" w:hAnsi="Times New Roman"/>
+                <w:b/>
+                <w:bCs/>
+                <w:sz w:val="24"/>
+                <w:szCs w:val="24"/>
+              </w:rPr>
+              <w:t xml:space="preserve">Agent share</w:t>
+            </w:r>
+          </w:p>
+        </w:tc>
+        <w:tc>
+          <w:tcPr>
+            <w:tcW w:type="dxa" w:w="1100"/>
+            <w:tcBorders>
+              <w:top w:val="single" w:color="000000" w:sz="4"/>
+              <w:left w:val="single" w:color="000000" w:sz="4"/>
+              <w:bottom w:val="single" w:color="000000" w:sz="4"/>
+              <w:right w:val="single" w:color="000000" w:sz="4"/>
+            </w:tcBorders>
+            <w:shd w:fill="D9D9D9" w:color="auto" w:val="clear"/>
+            <w:tcMar>
+              <w:top w:type="dxa" w:w="60"/>
+              <w:left w:type="dxa" w:w="100"/>
+              <w:bottom w:type="dxa" w:w="60"/>
+              <w:right w:type="dxa" w:w="100"/>
+            </w:tcMar>
+          </w:tcPr>
+          <w:p>
+            <w:pPr>
+              <w:spacing w:line="276"/>
+              <w:jc w:val="left"/>
+            </w:pPr>
+            <w:r>
+              <w:rPr>
+                <w:rFonts w:ascii="Times New Roman" w:cs="Times New Roman" w:eastAsia="Times New Roman" w:hAnsi="Times New Roman"/>
+                <w:b/>
+                <w:bCs/>
+                <w:sz w:val="24"/>
+                <w:szCs w:val="24"/>
+              </w:rPr>
+              <w:t xml:space="preserve">Jain index</w:t>
+            </w:r>
+          </w:p>
+        </w:tc>
+        <w:tc>
+          <w:tcPr>
+            <w:tcW w:type="dxa" w:w="1300"/>
+            <w:tcBorders>
+              <w:top w:val="single" w:color="000000" w:sz="4"/>
+              <w:left w:val="single" w:color="000000" w:sz="4"/>
+              <w:bottom w:val="single" w:color="000000" w:sz="4"/>
+              <w:right w:val="single" w:color="000000" w:sz="4"/>
+            </w:tcBorders>
+            <w:shd w:fill="D9D9D9" w:color="auto" w:val="clear"/>
+            <w:tcMar>
+              <w:top w:type="dxa" w:w="60"/>
+              <w:left w:type="dxa" w:w="100"/>
+              <w:bottom w:type="dxa" w:w="60"/>
+              <w:right w:type="dxa" w:w="100"/>
+            </w:tcMar>
+          </w:tcPr>
+          <w:p>
+            <w:pPr>
+              <w:spacing w:line="276"/>
+              <w:jc w:val="left"/>
+            </w:pPr>
+            <w:r>
+              <w:rPr>
+                <w:rFonts w:ascii="Times New Roman" w:cs="Times New Roman" w:eastAsia="Times New Roman" w:hAnsi="Times New Roman"/>
+                <w:b/>
+                <w:bCs/>
+                <w:sz w:val="24"/>
+                <w:szCs w:val="24"/>
+              </w:rPr>
+              <w:t xml:space="preserve">Agent time</w:t>
+            </w:r>
+          </w:p>
+        </w:tc>
+        <w:tc>
+          <w:tcPr>
+            <w:tcW w:type="dxa" w:w="1300"/>
+            <w:tcBorders>
+              <w:top w:val="single" w:color="000000" w:sz="4"/>
+              <w:left w:val="single" w:color="000000" w:sz="4"/>
+              <w:bottom w:val="single" w:color="000000" w:sz="4"/>
+              <w:right w:val="single" w:color="000000" w:sz="4"/>
+            </w:tcBorders>
+            <w:shd w:fill="D9D9D9" w:color="auto" w:val="clear"/>
+            <w:tcMar>
+              <w:top w:type="dxa" w:w="60"/>
+              <w:left w:type="dxa" w:w="100"/>
+              <w:bottom w:type="dxa" w:w="60"/>
+              <w:right w:type="dxa" w:w="100"/>
+            </w:tcMar>
+          </w:tcPr>
+          <w:p>
+            <w:pPr>
+              <w:spacing w:line="276"/>
+              <w:jc w:val="left"/>
+            </w:pPr>
+            <w:r>
+              <w:rPr>
+                <w:rFonts w:ascii="Times New Roman" w:cs="Times New Roman" w:eastAsia="Times New Roman" w:hAnsi="Times New Roman"/>
+                <w:b/>
+                <w:bCs/>
+                <w:sz w:val="24"/>
+                <w:szCs w:val="24"/>
+              </w:rPr>
+              <w:t xml:space="preserve">AIMD time</w:t>
+            </w:r>
+          </w:p>
+        </w:tc>
+        <w:tc>
+          <w:tcPr>
+            <w:tcW w:type="dxa" w:w="1326"/>
+            <w:tcBorders>
+              <w:top w:val="single" w:color="000000" w:sz="4"/>
+              <w:left w:val="single" w:color="000000" w:sz="4"/>
+              <w:bottom w:val="single" w:color="000000" w:sz="4"/>
+              <w:right w:val="single" w:color="000000" w:sz="4"/>
+            </w:tcBorders>
+            <w:shd w:fill="D9D9D9" w:color="auto" w:val="clear"/>
+            <w:tcMar>
+              <w:top w:type="dxa" w:w="60"/>
+              <w:left w:type="dxa" w:w="100"/>
+              <w:bottom w:type="dxa" w:w="60"/>
+              <w:right w:type="dxa" w:w="100"/>
+            </w:tcMar>
+          </w:tcPr>
+          <w:p>
+            <w:pPr>
+              <w:spacing w:line="276"/>
+              <w:jc w:val="left"/>
+            </w:pPr>
+            <w:r>
+              <w:rPr>
+                <w:rFonts w:ascii="Times New Roman" w:cs="Times New Roman" w:eastAsia="Times New Roman" w:hAnsi="Times New Roman"/>
+                <w:b/>
+                <w:bCs/>
+                <w:sz w:val="24"/>
+                <w:szCs w:val="24"/>
+              </w:rPr>
+              <w:t xml:space="preserve">Runs</w:t>
+            </w:r>
+          </w:p>
+        </w:tc>
+      </w:tr>
+      <w:tr>
+        <w:trPr>
+          <w:cantSplit/>
+          <w:tblHeader w:val="false"/>
+        </w:trPr>
+        <w:tc>
+          <w:tcPr>
+            <w:tcW w:type="dxa" w:w="2800"/>
+            <w:tcBorders>
+              <w:top w:val="single" w:color="000000" w:sz="4"/>
+              <w:left w:val="single" w:color="000000" w:sz="4"/>
+              <w:bottom w:val="single" w:color="000000" w:sz="4"/>
+              <w:right w:val="single" w:color="000000" w:sz="4"/>
+            </w:tcBorders>
+            <w:tcMar>
+              <w:top w:type="dxa" w:w="60"/>
+              <w:left w:type="dxa" w:w="100"/>
+              <w:bottom w:type="dxa" w:w="60"/>
+              <w:right w:type="dxa" w:w="100"/>
+            </w:tcMar>
+          </w:tcPr>
+          <w:p>
+            <w:pPr>
+              <w:spacing w:line="276"/>
+              <w:jc w:val="left"/>
+            </w:pPr>
+            <w:r>
+              <w:rPr>
+                <w:rFonts w:ascii="Times New Roman" w:cs="Times New Roman" w:eastAsia="Times New Roman" w:hAnsi="Times New Roman"/>
+                <w:b w:val="false"/>
+                <w:bCs w:val="false"/>
+                <w:sz w:val="24"/>
+                <w:szCs w:val="24"/>
+              </w:rPr>
+              <w:t xml:space="preserve">Default (no polite mode)</w:t>
+            </w:r>
+          </w:p>
+        </w:tc>
+        <w:tc>
+          <w:tcPr>
+            <w:tcW w:type="dxa" w:w="1200"/>
+            <w:tcBorders>
+              <w:top w:val="single" w:color="000000" w:sz="4"/>
+              <w:left w:val="single" w:color="000000" w:sz="4"/>
+              <w:bottom w:val="single" w:color="000000" w:sz="4"/>
+              <w:right w:val="single" w:color="000000" w:sz="4"/>
+            </w:tcBorders>
+            <w:tcMar>
+              <w:top w:type="dxa" w:w="60"/>
+              <w:left w:type="dxa" w:w="100"/>
+              <w:bottom w:type="dxa" w:w="60"/>
+              <w:right w:type="dxa" w:w="100"/>
+            </w:tcMar>
+          </w:tcPr>
+          <w:p>
+            <w:pPr>
+              <w:spacing w:line="276"/>
+              <w:jc w:val="left"/>
+            </w:pPr>
+            <w:r>
+              <w:rPr>
+                <w:rFonts w:ascii="Times New Roman" w:cs="Times New Roman" w:eastAsia="Times New Roman" w:hAnsi="Times New Roman"/>
+                <w:b w:val="false"/>
+                <w:bCs w:val="false"/>
+                <w:sz w:val="24"/>
+                <w:szCs w:val="24"/>
+              </w:rPr>
+              <w:t xml:space="preserve">70%</w:t>
+            </w:r>
+          </w:p>
+        </w:tc>
+        <w:tc>
+          <w:tcPr>
+            <w:tcW w:type="dxa" w:w="1100"/>
+            <w:tcBorders>
+              <w:top w:val="single" w:color="000000" w:sz="4"/>
+              <w:left w:val="single" w:color="000000" w:sz="4"/>
+              <w:bottom w:val="single" w:color="000000" w:sz="4"/>
+              <w:right w:val="single" w:color="000000" w:sz="4"/>
+            </w:tcBorders>
+            <w:tcMar>
+              <w:top w:type="dxa" w:w="60"/>
+              <w:left w:type="dxa" w:w="100"/>
+              <w:bottom w:type="dxa" w:w="60"/>
+              <w:right w:type="dxa" w:w="100"/>
+            </w:tcMar>
+          </w:tcPr>
+          <w:p>
+            <w:pPr>
+              <w:spacing w:line="276"/>
+              <w:jc w:val="left"/>
+            </w:pPr>
+            <w:r>
+              <w:rPr>
+                <w:rFonts w:ascii="Times New Roman" w:cs="Times New Roman" w:eastAsia="Times New Roman" w:hAnsi="Times New Roman"/>
+                <w:b w:val="false"/>
+                <w:bCs w:val="false"/>
+                <w:sz w:val="24"/>
+                <w:szCs w:val="24"/>
+              </w:rPr>
+              <w:t xml:space="preserve">0.860</w:t>
+            </w:r>
+          </w:p>
+        </w:tc>
+        <w:tc>
+          <w:tcPr>
+            <w:tcW w:type="dxa" w:w="1300"/>
+            <w:tcBorders>
+              <w:top w:val="single" w:color="000000" w:sz="4"/>
+              <w:left w:val="single" w:color="000000" w:sz="4"/>
+              <w:bottom w:val="single" w:color="000000" w:sz="4"/>
+              <w:right w:val="single" w:color="000000" w:sz="4"/>
+            </w:tcBorders>
+            <w:tcMar>
+              <w:top w:type="dxa" w:w="60"/>
+              <w:left w:type="dxa" w:w="100"/>
+              <w:bottom w:type="dxa" w:w="60"/>
+              <w:right w:type="dxa" w:w="100"/>
+            </w:tcMar>
+          </w:tcPr>
+          <w:p>
+            <w:pPr>
+              <w:spacing w:line="276"/>
+              <w:jc w:val="left"/>
+            </w:pPr>
+            <w:r>
+              <w:rPr>
+                <w:rFonts w:ascii="Times New Roman" w:cs="Times New Roman" w:eastAsia="Times New Roman" w:hAnsi="Times New Roman"/>
+                <w:b w:val="false"/>
+                <w:bCs w:val="false"/>
+                <w:sz w:val="24"/>
+                <w:szCs w:val="24"/>
+              </w:rPr>
+              <w:t xml:space="preserve">4.7 s</w:t>
+            </w:r>
+          </w:p>
+        </w:tc>
+        <w:tc>
+          <w:tcPr>
+            <w:tcW w:type="dxa" w:w="1300"/>
+            <w:tcBorders>
+              <w:top w:val="single" w:color="000000" w:sz="4"/>
+              <w:left w:val="single" w:color="000000" w:sz="4"/>
+              <w:bottom w:val="single" w:color="000000" w:sz="4"/>
+              <w:right w:val="single" w:color="000000" w:sz="4"/>
+            </w:tcBorders>
+            <w:tcMar>
+              <w:top w:type="dxa" w:w="60"/>
+              <w:left w:type="dxa" w:w="100"/>
+              <w:bottom w:type="dxa" w:w="60"/>
+              <w:right w:type="dxa" w:w="100"/>
+            </w:tcMar>
+          </w:tcPr>
+          <w:p>
+            <w:pPr>
+              <w:spacing w:line="276"/>
+              <w:jc w:val="left"/>
+            </w:pPr>
+            <w:r>
+              <w:rPr>
+                <w:rFonts w:ascii="Times New Roman" w:cs="Times New Roman" w:eastAsia="Times New Roman" w:hAnsi="Times New Roman"/>
+                <w:b w:val="false"/>
+                <w:bCs w:val="false"/>
+                <w:sz w:val="24"/>
+                <w:szCs w:val="24"/>
+              </w:rPr>
+              <w:t xml:space="preserve">7.8 s</w:t>
+            </w:r>
+          </w:p>
+        </w:tc>
+        <w:tc>
+          <w:tcPr>
+            <w:tcW w:type="dxa" w:w="1326"/>
+            <w:tcBorders>
+              <w:top w:val="single" w:color="000000" w:sz="4"/>
+              <w:left w:val="single" w:color="000000" w:sz="4"/>
+              <w:bottom w:val="single" w:color="000000" w:sz="4"/>
+              <w:right w:val="single" w:color="000000" w:sz="4"/>
+            </w:tcBorders>
+            <w:tcMar>
+              <w:top w:type="dxa" w:w="60"/>
+              <w:left w:type="dxa" w:w="100"/>
+              <w:bottom w:type="dxa" w:w="60"/>
+              <w:right w:type="dxa" w:w="100"/>
+            </w:tcMar>
+          </w:tcPr>
+          <w:p>
+            <w:pPr>
+              <w:spacing w:line="276"/>
+              <w:jc w:val="left"/>
+            </w:pPr>
+            <w:r>
+              <w:rPr>
+                <w:rFonts w:ascii="Times New Roman" w:cs="Times New Roman" w:eastAsia="Times New Roman" w:hAnsi="Times New Roman"/>
+                <w:b w:val="false"/>
+                <w:bCs w:val="false"/>
+                <w:sz w:val="24"/>
+                <w:szCs w:val="24"/>
+              </w:rPr>
+              <w:t xml:space="preserve">8</w:t>
+            </w:r>
+          </w:p>
+        </w:tc>
+      </w:tr>
+      <w:tr>
+        <w:trPr>
+          <w:cantSplit/>
+          <w:tblHeader w:val="false"/>
+        </w:trPr>
+        <w:tc>
+          <w:tcPr>
+            <w:tcW w:type="dxa" w:w="2800"/>
+            <w:tcBorders>
+              <w:top w:val="single" w:color="000000" w:sz="4"/>
+              <w:left w:val="single" w:color="000000" w:sz="4"/>
+              <w:bottom w:val="single" w:color="000000" w:sz="4"/>
+              <w:right w:val="single" w:color="000000" w:sz="4"/>
+            </w:tcBorders>
+            <w:tcMar>
+              <w:top w:type="dxa" w:w="60"/>
+              <w:left w:type="dxa" w:w="100"/>
+              <w:bottom w:type="dxa" w:w="60"/>
+              <w:right w:type="dxa" w:w="100"/>
+            </w:tcMar>
+          </w:tcPr>
+          <w:p>
+            <w:pPr>
+              <w:spacing w:line="276"/>
+              <w:jc w:val="left"/>
+            </w:pPr>
+            <w:r>
+              <w:rPr>
+                <w:rFonts w:ascii="Times New Roman" w:cs="Times New Roman" w:eastAsia="Times New Roman" w:hAnsi="Times New Roman"/>
+                <w:b w:val="false"/>
+                <w:bCs w:val="false"/>
+                <w:sz w:val="24"/>
+                <w:szCs w:val="24"/>
+              </w:rPr>
+              <w:t xml:space="preserve">--polite 1.2</w:t>
+            </w:r>
+          </w:p>
+        </w:tc>
+        <w:tc>
+          <w:tcPr>
+            <w:tcW w:type="dxa" w:w="1200"/>
+            <w:tcBorders>
+              <w:top w:val="single" w:color="000000" w:sz="4"/>
+              <w:left w:val="single" w:color="000000" w:sz="4"/>
+              <w:bottom w:val="single" w:color="000000" w:sz="4"/>
+              <w:right w:val="single" w:color="000000" w:sz="4"/>
+            </w:tcBorders>
+            <w:tcMar>
+              <w:top w:type="dxa" w:w="60"/>
+              <w:left w:type="dxa" w:w="100"/>
+              <w:bottom w:type="dxa" w:w="60"/>
+              <w:right w:type="dxa" w:w="100"/>
+            </w:tcMar>
+          </w:tcPr>
+          <w:p>
+            <w:pPr>
+              <w:spacing w:line="276"/>
+              <w:jc w:val="left"/>
+            </w:pPr>
+            <w:r>
+              <w:rPr>
+                <w:rFonts w:ascii="Times New Roman" w:cs="Times New Roman" w:eastAsia="Times New Roman" w:hAnsi="Times New Roman"/>
+                <w:b w:val="false"/>
+                <w:bCs w:val="false"/>
+                <w:sz w:val="24"/>
+                <w:szCs w:val="24"/>
+              </w:rPr>
+              <w:t xml:space="preserve">49%</w:t>
+            </w:r>
+          </w:p>
+        </w:tc>
+        <w:tc>
+          <w:tcPr>
+            <w:tcW w:type="dxa" w:w="1100"/>
+            <w:tcBorders>
+              <w:top w:val="single" w:color="000000" w:sz="4"/>
+              <w:left w:val="single" w:color="000000" w:sz="4"/>
+              <w:bottom w:val="single" w:color="000000" w:sz="4"/>
+              <w:right w:val="single" w:color="000000" w:sz="4"/>
+            </w:tcBorders>
+            <w:tcMar>
+              <w:top w:type="dxa" w:w="60"/>
+              <w:left w:type="dxa" w:w="100"/>
+              <w:bottom w:type="dxa" w:w="60"/>
+              <w:right w:type="dxa" w:w="100"/>
+            </w:tcMar>
+          </w:tcPr>
+          <w:p>
+            <w:pPr>
+              <w:spacing w:line="276"/>
+              <w:jc w:val="left"/>
+            </w:pPr>
+            <w:r>
+              <w:rPr>
+                <w:rFonts w:ascii="Times New Roman" w:cs="Times New Roman" w:eastAsia="Times New Roman" w:hAnsi="Times New Roman"/>
+                <w:b w:val="false"/>
+                <w:bCs w:val="false"/>
+                <w:sz w:val="24"/>
+                <w:szCs w:val="24"/>
+              </w:rPr>
+              <w:t xml:space="preserve">0.945</w:t>
+            </w:r>
+          </w:p>
+        </w:tc>
+        <w:tc>
+          <w:tcPr>
+            <w:tcW w:type="dxa" w:w="1300"/>
+            <w:tcBorders>
+              <w:top w:val="single" w:color="000000" w:sz="4"/>
+              <w:left w:val="single" w:color="000000" w:sz="4"/>
+              <w:bottom w:val="single" w:color="000000" w:sz="4"/>
+              <w:right w:val="single" w:color="000000" w:sz="4"/>
+            </w:tcBorders>
+            <w:tcMar>
+              <w:top w:type="dxa" w:w="60"/>
+              <w:left w:type="dxa" w:w="100"/>
+              <w:bottom w:type="dxa" w:w="60"/>
+              <w:right w:type="dxa" w:w="100"/>
+            </w:tcMar>
+          </w:tcPr>
+          <w:p>
+            <w:pPr>
+              <w:spacing w:line="276"/>
+              <w:jc w:val="left"/>
+            </w:pPr>
+            <w:r>
+              <w:rPr>
+                <w:rFonts w:ascii="Times New Roman" w:cs="Times New Roman" w:eastAsia="Times New Roman" w:hAnsi="Times New Roman"/>
+                <w:b w:val="false"/>
+                <w:bCs w:val="false"/>
+                <w:sz w:val="24"/>
+                <w:szCs w:val="24"/>
+              </w:rPr>
+              <w:t xml:space="preserve">5.3 s</w:t>
+            </w:r>
+          </w:p>
+        </w:tc>
+        <w:tc>
+          <w:tcPr>
+            <w:tcW w:type="dxa" w:w="1300"/>
+            <w:tcBorders>
+              <w:top w:val="single" w:color="000000" w:sz="4"/>
+              <w:left w:val="single" w:color="000000" w:sz="4"/>
+              <w:bottom w:val="single" w:color="000000" w:sz="4"/>
+              <w:right w:val="single" w:color="000000" w:sz="4"/>
+            </w:tcBorders>
+            <w:tcMar>
+              <w:top w:type="dxa" w:w="60"/>
+              <w:left w:type="dxa" w:w="100"/>
+              <w:bottom w:type="dxa" w:w="60"/>
+              <w:right w:type="dxa" w:w="100"/>
+            </w:tcMar>
+          </w:tcPr>
+          <w:p>
+            <w:pPr>
+              <w:spacing w:line="276"/>
+              <w:jc w:val="left"/>
+            </w:pPr>
+            <w:r>
+              <w:rPr>
+                <w:rFonts w:ascii="Times New Roman" w:cs="Times New Roman" w:eastAsia="Times New Roman" w:hAnsi="Times New Roman"/>
+                <w:b w:val="false"/>
+                <w:bCs w:val="false"/>
+                <w:sz w:val="24"/>
+                <w:szCs w:val="24"/>
+              </w:rPr>
+              <w:t xml:space="preserve">5.4 s</w:t>
+            </w:r>
+          </w:p>
+        </w:tc>
+        <w:tc>
+          <w:tcPr>
+            <w:tcW w:type="dxa" w:w="1326"/>
+            <w:tcBorders>
+              <w:top w:val="single" w:color="000000" w:sz="4"/>
+              <w:left w:val="single" w:color="000000" w:sz="4"/>
+              <w:bottom w:val="single" w:color="000000" w:sz="4"/>
+              <w:right w:val="single" w:color="000000" w:sz="4"/>
+            </w:tcBorders>
+            <w:tcMar>
+              <w:top w:type="dxa" w:w="60"/>
+              <w:left w:type="dxa" w:w="100"/>
+              <w:bottom w:type="dxa" w:w="60"/>
+              <w:right w:type="dxa" w:w="100"/>
+            </w:tcMar>
+          </w:tcPr>
+          <w:p>
+            <w:pPr>
+              <w:spacing w:line="276"/>
+              <w:jc w:val="left"/>
+            </w:pPr>
+            <w:r>
+              <w:rPr>
+                <w:rFonts w:ascii="Times New Roman" w:cs="Times New Roman" w:eastAsia="Times New Roman" w:hAnsi="Times New Roman"/>
+                <w:b w:val="false"/>
+                <w:bCs w:val="false"/>
+                <w:sz w:val="24"/>
+                <w:szCs w:val="24"/>
+              </w:rPr>
+              <w:t xml:space="preserve">8</w:t>
+            </w:r>
+          </w:p>
+        </w:tc>
+      </w:tr>
+      <w:tr>
+        <w:trPr>
+          <w:cantSplit/>
+          <w:tblHeader w:val="false"/>
+        </w:trPr>
+        <w:tc>
+          <w:tcPr>
+            <w:tcW w:type="dxa" w:w="2800"/>
+            <w:tcBorders>
+              <w:top w:val="single" w:color="000000" w:sz="4"/>
+              <w:left w:val="single" w:color="000000" w:sz="4"/>
+              <w:bottom w:val="single" w:color="000000" w:sz="4"/>
+              <w:right w:val="single" w:color="000000" w:sz="4"/>
+            </w:tcBorders>
+            <w:tcMar>
+              <w:top w:type="dxa" w:w="60"/>
+              <w:left w:type="dxa" w:w="100"/>
+              <w:bottom w:type="dxa" w:w="60"/>
+              <w:right w:type="dxa" w:w="100"/>
+            </w:tcMar>
+          </w:tcPr>
+          <w:p>
+            <w:pPr>
+              <w:spacing w:line="276"/>
+              <w:jc w:val="left"/>
+            </w:pPr>
+            <w:r>
+              <w:rPr>
+                <w:rFonts w:ascii="Times New Roman" w:cs="Times New Roman" w:eastAsia="Times New Roman" w:hAnsi="Times New Roman"/>
+                <w:b w:val="false"/>
+                <w:bCs w:val="false"/>
+                <w:sz w:val="24"/>
+                <w:szCs w:val="24"/>
+              </w:rPr>
+              <w:t xml:space="preserve">--polite 1.3 (recommended)</w:t>
+            </w:r>
+          </w:p>
+        </w:tc>
+        <w:tc>
+          <w:tcPr>
+            <w:tcW w:type="dxa" w:w="1200"/>
+            <w:tcBorders>
+              <w:top w:val="single" w:color="000000" w:sz="4"/>
+              <w:left w:val="single" w:color="000000" w:sz="4"/>
+              <w:bottom w:val="single" w:color="000000" w:sz="4"/>
+              <w:right w:val="single" w:color="000000" w:sz="4"/>
+            </w:tcBorders>
+            <w:tcMar>
+              <w:top w:type="dxa" w:w="60"/>
+              <w:left w:type="dxa" w:w="100"/>
+              <w:bottom w:type="dxa" w:w="60"/>
+              <w:right w:type="dxa" w:w="100"/>
+            </w:tcMar>
+          </w:tcPr>
+          <w:p>
+            <w:pPr>
+              <w:spacing w:line="276"/>
+              <w:jc w:val="left"/>
+            </w:pPr>
+            <w:r>
+              <w:rPr>
+                <w:rFonts w:ascii="Times New Roman" w:cs="Times New Roman" w:eastAsia="Times New Roman" w:hAnsi="Times New Roman"/>
+                <w:b w:val="false"/>
+                <w:bCs w:val="false"/>
+                <w:sz w:val="24"/>
+                <w:szCs w:val="24"/>
+              </w:rPr>
+              <w:t xml:space="preserve">52%</w:t>
+            </w:r>
+          </w:p>
+        </w:tc>
+        <w:tc>
+          <w:tcPr>
+            <w:tcW w:type="dxa" w:w="1100"/>
+            <w:tcBorders>
+              <w:top w:val="single" w:color="000000" w:sz="4"/>
+              <w:left w:val="single" w:color="000000" w:sz="4"/>
+              <w:bottom w:val="single" w:color="000000" w:sz="4"/>
+              <w:right w:val="single" w:color="000000" w:sz="4"/>
+            </w:tcBorders>
+            <w:tcMar>
+              <w:top w:type="dxa" w:w="60"/>
+              <w:left w:type="dxa" w:w="100"/>
+              <w:bottom w:type="dxa" w:w="60"/>
+              <w:right w:type="dxa" w:w="100"/>
+            </w:tcMar>
+          </w:tcPr>
+          <w:p>
+            <w:pPr>
+              <w:spacing w:line="276"/>
+              <w:jc w:val="left"/>
+            </w:pPr>
+            <w:r>
+              <w:rPr>
+                <w:rFonts w:ascii="Times New Roman" w:cs="Times New Roman" w:eastAsia="Times New Roman" w:hAnsi="Times New Roman"/>
+                <w:b w:val="false"/>
+                <w:bCs w:val="false"/>
+                <w:sz w:val="24"/>
+                <w:szCs w:val="24"/>
+              </w:rPr>
+              <w:t xml:space="preserve">0.936</w:t>
+            </w:r>
+          </w:p>
+        </w:tc>
+        <w:tc>
+          <w:tcPr>
+            <w:tcW w:type="dxa" w:w="1300"/>
+            <w:tcBorders>
+              <w:top w:val="single" w:color="000000" w:sz="4"/>
+              <w:left w:val="single" w:color="000000" w:sz="4"/>
+              <w:bottom w:val="single" w:color="000000" w:sz="4"/>
+              <w:right w:val="single" w:color="000000" w:sz="4"/>
+            </w:tcBorders>
+            <w:tcMar>
+              <w:top w:type="dxa" w:w="60"/>
+              <w:left w:type="dxa" w:w="100"/>
+              <w:bottom w:type="dxa" w:w="60"/>
+              <w:right w:type="dxa" w:w="100"/>
+            </w:tcMar>
+          </w:tcPr>
+          <w:p>
+            <w:pPr>
+              <w:spacing w:line="276"/>
+              <w:jc w:val="left"/>
+            </w:pPr>
+            <w:r>
+              <w:rPr>
+                <w:rFonts w:ascii="Times New Roman" w:cs="Times New Roman" w:eastAsia="Times New Roman" w:hAnsi="Times New Roman"/>
+                <w:b w:val="false"/>
+                <w:bCs w:val="false"/>
+                <w:sz w:val="24"/>
+                <w:szCs w:val="24"/>
+              </w:rPr>
+              <w:t xml:space="preserve">5.1 s</w:t>
+            </w:r>
+          </w:p>
+        </w:tc>
+        <w:tc>
+          <w:tcPr>
+            <w:tcW w:type="dxa" w:w="1300"/>
+            <w:tcBorders>
+              <w:top w:val="single" w:color="000000" w:sz="4"/>
+              <w:left w:val="single" w:color="000000" w:sz="4"/>
+              <w:bottom w:val="single" w:color="000000" w:sz="4"/>
+              <w:right w:val="single" w:color="000000" w:sz="4"/>
+            </w:tcBorders>
+            <w:tcMar>
+              <w:top w:type="dxa" w:w="60"/>
+              <w:left w:type="dxa" w:w="100"/>
+              <w:bottom w:type="dxa" w:w="60"/>
+              <w:right w:type="dxa" w:w="100"/>
+            </w:tcMar>
+          </w:tcPr>
+          <w:p>
+            <w:pPr>
+              <w:spacing w:line="276"/>
+              <w:jc w:val="left"/>
+            </w:pPr>
+            <w:r>
+              <w:rPr>
+                <w:rFonts w:ascii="Times New Roman" w:cs="Times New Roman" w:eastAsia="Times New Roman" w:hAnsi="Times New Roman"/>
+                <w:b w:val="false"/>
+                <w:bCs w:val="false"/>
+                <w:sz w:val="24"/>
+                <w:szCs w:val="24"/>
+              </w:rPr>
+              <w:t xml:space="preserve">5.8 s</w:t>
+            </w:r>
+          </w:p>
+        </w:tc>
+        <w:tc>
+          <w:tcPr>
+            <w:tcW w:type="dxa" w:w="1326"/>
+            <w:tcBorders>
+              <w:top w:val="single" w:color="000000" w:sz="4"/>
+              <w:left w:val="single" w:color="000000" w:sz="4"/>
+              <w:bottom w:val="single" w:color="000000" w:sz="4"/>
+              <w:right w:val="single" w:color="000000" w:sz="4"/>
+            </w:tcBorders>
+            <w:tcMar>
+              <w:top w:type="dxa" w:w="60"/>
+              <w:left w:type="dxa" w:w="100"/>
+              <w:bottom w:type="dxa" w:w="60"/>
+              <w:right w:type="dxa" w:w="100"/>
+            </w:tcMar>
+          </w:tcPr>
+          <w:p>
+            <w:pPr>
+              <w:spacing w:line="276"/>
+              <w:jc w:val="left"/>
+            </w:pPr>
+            <w:r>
+              <w:rPr>
+                <w:rFonts w:ascii="Times New Roman" w:cs="Times New Roman" w:eastAsia="Times New Roman" w:hAnsi="Times New Roman"/>
+                <w:b w:val="false"/>
+                <w:bCs w:val="false"/>
+                <w:sz w:val="24"/>
+                <w:szCs w:val="24"/>
+              </w:rPr>
+              <w:t xml:space="preserve">8</w:t>
+            </w:r>
+          </w:p>
+        </w:tc>
+      </w:tr>
+      <w:tr>
+        <w:trPr>
+          <w:cantSplit/>
+          <w:tblHeader w:val="false"/>
+        </w:trPr>
+        <w:tc>
+          <w:tcPr>
+            <w:tcW w:type="dxa" w:w="2800"/>
+            <w:tcBorders>
+              <w:top w:val="single" w:color="000000" w:sz="4"/>
+              <w:left w:val="single" w:color="000000" w:sz="4"/>
+              <w:bottom w:val="single" w:color="000000" w:sz="4"/>
+              <w:right w:val="single" w:color="000000" w:sz="4"/>
+            </w:tcBorders>
+            <w:tcMar>
+              <w:top w:type="dxa" w:w="60"/>
+              <w:left w:type="dxa" w:w="100"/>
+              <w:bottom w:type="dxa" w:w="60"/>
+              <w:right w:type="dxa" w:w="100"/>
+            </w:tcMar>
+          </w:tcPr>
+          <w:p>
+            <w:pPr>
+              <w:spacing w:line="276"/>
+              <w:jc w:val="left"/>
+            </w:pPr>
+            <w:r>
+              <w:rPr>
+                <w:rFonts w:ascii="Times New Roman" w:cs="Times New Roman" w:eastAsia="Times New Roman" w:hAnsi="Times New Roman"/>
+                <w:b w:val="false"/>
+                <w:bCs w:val="false"/>
+                <w:sz w:val="24"/>
+                <w:szCs w:val="24"/>
+              </w:rPr>
+              <w:t xml:space="preserve">--polite 1.4</w:t>
+            </w:r>
+          </w:p>
+        </w:tc>
+        <w:tc>
+          <w:tcPr>
+            <w:tcW w:type="dxa" w:w="1200"/>
+            <w:tcBorders>
+              <w:top w:val="single" w:color="000000" w:sz="4"/>
+              <w:left w:val="single" w:color="000000" w:sz="4"/>
+              <w:bottom w:val="single" w:color="000000" w:sz="4"/>
+              <w:right w:val="single" w:color="000000" w:sz="4"/>
+            </w:tcBorders>
+            <w:tcMar>
+              <w:top w:type="dxa" w:w="60"/>
+              <w:left w:type="dxa" w:w="100"/>
+              <w:bottom w:type="dxa" w:w="60"/>
+              <w:right w:type="dxa" w:w="100"/>
+            </w:tcMar>
+          </w:tcPr>
+          <w:p>
+            <w:pPr>
+              <w:spacing w:line="276"/>
+              <w:jc w:val="left"/>
+            </w:pPr>
+            <w:r>
+              <w:rPr>
+                <w:rFonts w:ascii="Times New Roman" w:cs="Times New Roman" w:eastAsia="Times New Roman" w:hAnsi="Times New Roman"/>
+                <w:b w:val="false"/>
+                <w:bCs w:val="false"/>
+                <w:sz w:val="24"/>
+                <w:szCs w:val="24"/>
+              </w:rPr>
+              <w:t xml:space="preserve">58%</w:t>
+            </w:r>
+          </w:p>
+        </w:tc>
+        <w:tc>
+          <w:tcPr>
+            <w:tcW w:type="dxa" w:w="1100"/>
+            <w:tcBorders>
+              <w:top w:val="single" w:color="000000" w:sz="4"/>
+              <w:left w:val="single" w:color="000000" w:sz="4"/>
+              <w:bottom w:val="single" w:color="000000" w:sz="4"/>
+              <w:right w:val="single" w:color="000000" w:sz="4"/>
+            </w:tcBorders>
+            <w:tcMar>
+              <w:top w:type="dxa" w:w="60"/>
+              <w:left w:type="dxa" w:w="100"/>
+              <w:bottom w:type="dxa" w:w="60"/>
+              <w:right w:type="dxa" w:w="100"/>
+            </w:tcMar>
+          </w:tcPr>
+          <w:p>
+            <w:pPr>
+              <w:spacing w:line="276"/>
+              <w:jc w:val="left"/>
+            </w:pPr>
+            <w:r>
+              <w:rPr>
+                <w:rFonts w:ascii="Times New Roman" w:cs="Times New Roman" w:eastAsia="Times New Roman" w:hAnsi="Times New Roman"/>
+                <w:b w:val="false"/>
+                <w:bCs w:val="false"/>
+                <w:sz w:val="24"/>
+                <w:szCs w:val="24"/>
+              </w:rPr>
+              <w:t xml:space="preserve">0.889</w:t>
+            </w:r>
+          </w:p>
+        </w:tc>
+        <w:tc>
+          <w:tcPr>
+            <w:tcW w:type="dxa" w:w="1300"/>
+            <w:tcBorders>
+              <w:top w:val="single" w:color="000000" w:sz="4"/>
+              <w:left w:val="single" w:color="000000" w:sz="4"/>
+              <w:bottom w:val="single" w:color="000000" w:sz="4"/>
+              <w:right w:val="single" w:color="000000" w:sz="4"/>
+            </w:tcBorders>
+            <w:tcMar>
+              <w:top w:type="dxa" w:w="60"/>
+              <w:left w:type="dxa" w:w="100"/>
+              <w:bottom w:type="dxa" w:w="60"/>
+              <w:right w:type="dxa" w:w="100"/>
+            </w:tcMar>
+          </w:tcPr>
+          <w:p>
+            <w:pPr>
+              <w:spacing w:line="276"/>
+              <w:jc w:val="left"/>
+            </w:pPr>
+            <w:r>
+              <w:rPr>
+                <w:rFonts w:ascii="Times New Roman" w:cs="Times New Roman" w:eastAsia="Times New Roman" w:hAnsi="Times New Roman"/>
+                <w:b w:val="false"/>
+                <w:bCs w:val="false"/>
+                <w:sz w:val="24"/>
+                <w:szCs w:val="24"/>
+              </w:rPr>
+              <w:t xml:space="preserve">4.8 s</w:t>
+            </w:r>
+          </w:p>
+        </w:tc>
+        <w:tc>
+          <w:tcPr>
+            <w:tcW w:type="dxa" w:w="1300"/>
+            <w:tcBorders>
+              <w:top w:val="single" w:color="000000" w:sz="4"/>
+              <w:left w:val="single" w:color="000000" w:sz="4"/>
+              <w:bottom w:val="single" w:color="000000" w:sz="4"/>
+              <w:right w:val="single" w:color="000000" w:sz="4"/>
+            </w:tcBorders>
+            <w:tcMar>
+              <w:top w:type="dxa" w:w="60"/>
+              <w:left w:type="dxa" w:w="100"/>
+              <w:bottom w:type="dxa" w:w="60"/>
+              <w:right w:type="dxa" w:w="100"/>
+            </w:tcMar>
+          </w:tcPr>
+          <w:p>
+            <w:pPr>
+              <w:spacing w:line="276"/>
+              <w:jc w:val="left"/>
+            </w:pPr>
+            <w:r>
+              <w:rPr>
+                <w:rFonts w:ascii="Times New Roman" w:cs="Times New Roman" w:eastAsia="Times New Roman" w:hAnsi="Times New Roman"/>
+                <w:b w:val="false"/>
+                <w:bCs w:val="false"/>
+                <w:sz w:val="24"/>
+                <w:szCs w:val="24"/>
+              </w:rPr>
+              <w:t xml:space="preserve">6.7 s</w:t>
+            </w:r>
+          </w:p>
+        </w:tc>
+        <w:tc>
+          <w:tcPr>
+            <w:tcW w:type="dxa" w:w="1326"/>
+            <w:tcBorders>
+              <w:top w:val="single" w:color="000000" w:sz="4"/>
+              <w:left w:val="single" w:color="000000" w:sz="4"/>
+              <w:bottom w:val="single" w:color="000000" w:sz="4"/>
+              <w:right w:val="single" w:color="000000" w:sz="4"/>
+            </w:tcBorders>
+            <w:tcMar>
+              <w:top w:type="dxa" w:w="60"/>
+              <w:left w:type="dxa" w:w="100"/>
+              <w:bottom w:type="dxa" w:w="60"/>
+              <w:right w:type="dxa" w:w="100"/>
+            </w:tcMar>
+          </w:tcPr>
+          <w:p>
+            <w:pPr>
+              <w:spacing w:line="276"/>
+              <w:jc w:val="left"/>
+            </w:pPr>
+            <w:r>
+              <w:rPr>
+                <w:rFonts w:ascii="Times New Roman" w:cs="Times New Roman" w:eastAsia="Times New Roman" w:hAnsi="Times New Roman"/>
+                <w:b w:val="false"/>
+                <w:bCs w:val="false"/>
+                <w:sz w:val="24"/>
+                <w:szCs w:val="24"/>
+              </w:rPr>
+              <w:t xml:space="preserve">8</w:t>
+            </w:r>
+          </w:p>
+        </w:tc>
+      </w:tr>
+      <w:tr>
+        <w:trPr>
+          <w:cantSplit/>
+          <w:tblHeader w:val="false"/>
+        </w:trPr>
+        <w:tc>
+          <w:tcPr>
+            <w:tcW w:type="dxa" w:w="2800"/>
+            <w:tcBorders>
+              <w:top w:val="single" w:color="000000" w:sz="4"/>
+              <w:left w:val="single" w:color="000000" w:sz="4"/>
+              <w:bottom w:val="single" w:color="000000" w:sz="4"/>
+              <w:right w:val="single" w:color="000000" w:sz="4"/>
+            </w:tcBorders>
+            <w:tcMar>
+              <w:top w:type="dxa" w:w="60"/>
+              <w:left w:type="dxa" w:w="100"/>
+              <w:bottom w:type="dxa" w:w="60"/>
+              <w:right w:type="dxa" w:w="100"/>
+            </w:tcMar>
+          </w:tcPr>
+          <w:p>
+            <w:pPr>
+              <w:spacing w:line="276"/>
+              <w:jc w:val="left"/>
+            </w:pPr>
+            <w:r>
+              <w:rPr>
+                <w:rFonts w:ascii="Times New Roman" w:cs="Times New Roman" w:eastAsia="Times New Roman" w:hAnsi="Times New Roman"/>
+                <w:b w:val="false"/>
+                <w:bCs w:val="false"/>
+                <w:sz w:val="24"/>
+                <w:szCs w:val="24"/>
+              </w:rPr>
+              <w:t xml:space="preserve">--polite 1.5</w:t>
+            </w:r>
+          </w:p>
+        </w:tc>
+        <w:tc>
+          <w:tcPr>
+            <w:tcW w:type="dxa" w:w="1200"/>
+            <w:tcBorders>
+              <w:top w:val="single" w:color="000000" w:sz="4"/>
+              <w:left w:val="single" w:color="000000" w:sz="4"/>
+              <w:bottom w:val="single" w:color="000000" w:sz="4"/>
+              <w:right w:val="single" w:color="000000" w:sz="4"/>
+            </w:tcBorders>
+            <w:tcMar>
+              <w:top w:type="dxa" w:w="60"/>
+              <w:left w:type="dxa" w:w="100"/>
+              <w:bottom w:type="dxa" w:w="60"/>
+              <w:right w:type="dxa" w:w="100"/>
+            </w:tcMar>
+          </w:tcPr>
+          <w:p>
+            <w:pPr>
+              <w:spacing w:line="276"/>
+              <w:jc w:val="left"/>
+            </w:pPr>
+            <w:r>
+              <w:rPr>
+                <w:rFonts w:ascii="Times New Roman" w:cs="Times New Roman" w:eastAsia="Times New Roman" w:hAnsi="Times New Roman"/>
+                <w:b w:val="false"/>
+                <w:bCs w:val="false"/>
+                <w:sz w:val="24"/>
+                <w:szCs w:val="24"/>
+              </w:rPr>
+              <w:t xml:space="preserve">59%</w:t>
+            </w:r>
+          </w:p>
+        </w:tc>
+        <w:tc>
+          <w:tcPr>
+            <w:tcW w:type="dxa" w:w="1100"/>
+            <w:tcBorders>
+              <w:top w:val="single" w:color="000000" w:sz="4"/>
+              <w:left w:val="single" w:color="000000" w:sz="4"/>
+              <w:bottom w:val="single" w:color="000000" w:sz="4"/>
+              <w:right w:val="single" w:color="000000" w:sz="4"/>
+            </w:tcBorders>
+            <w:tcMar>
+              <w:top w:type="dxa" w:w="60"/>
+              <w:left w:type="dxa" w:w="100"/>
+              <w:bottom w:type="dxa" w:w="60"/>
+              <w:right w:type="dxa" w:w="100"/>
+            </w:tcMar>
+          </w:tcPr>
+          <w:p>
+            <w:pPr>
+              <w:spacing w:line="276"/>
+              <w:jc w:val="left"/>
+            </w:pPr>
+            <w:r>
+              <w:rPr>
+                <w:rFonts w:ascii="Times New Roman" w:cs="Times New Roman" w:eastAsia="Times New Roman" w:hAnsi="Times New Roman"/>
+                <w:b w:val="false"/>
+                <w:bCs w:val="false"/>
+                <w:sz w:val="24"/>
+                <w:szCs w:val="24"/>
+              </w:rPr>
+              <w:t xml:space="preserve">0.896</w:t>
+            </w:r>
+          </w:p>
+        </w:tc>
+        <w:tc>
+          <w:tcPr>
+            <w:tcW w:type="dxa" w:w="1300"/>
+            <w:tcBorders>
+              <w:top w:val="single" w:color="000000" w:sz="4"/>
+              <w:left w:val="single" w:color="000000" w:sz="4"/>
+              <w:bottom w:val="single" w:color="000000" w:sz="4"/>
+              <w:right w:val="single" w:color="000000" w:sz="4"/>
+            </w:tcBorders>
+            <w:tcMar>
+              <w:top w:type="dxa" w:w="60"/>
+              <w:left w:type="dxa" w:w="100"/>
+              <w:bottom w:type="dxa" w:w="60"/>
+              <w:right w:type="dxa" w:w="100"/>
+            </w:tcMar>
+          </w:tcPr>
+          <w:p>
+            <w:pPr>
+              <w:spacing w:line="276"/>
+              <w:jc w:val="left"/>
+            </w:pPr>
+            <w:r>
+              <w:rPr>
+                <w:rFonts w:ascii="Times New Roman" w:cs="Times New Roman" w:eastAsia="Times New Roman" w:hAnsi="Times New Roman"/>
+                <w:b w:val="false"/>
+                <w:bCs w:val="false"/>
+                <w:sz w:val="24"/>
+                <w:szCs w:val="24"/>
+              </w:rPr>
+              <w:t xml:space="preserve">5.1 s</w:t>
+            </w:r>
+          </w:p>
+        </w:tc>
+        <w:tc>
+          <w:tcPr>
+            <w:tcW w:type="dxa" w:w="1300"/>
+            <w:tcBorders>
+              <w:top w:val="single" w:color="000000" w:sz="4"/>
+              <w:left w:val="single" w:color="000000" w:sz="4"/>
+              <w:bottom w:val="single" w:color="000000" w:sz="4"/>
+              <w:right w:val="single" w:color="000000" w:sz="4"/>
+            </w:tcBorders>
+            <w:tcMar>
+              <w:top w:type="dxa" w:w="60"/>
+              <w:left w:type="dxa" w:w="100"/>
+              <w:bottom w:type="dxa" w:w="60"/>
+              <w:right w:type="dxa" w:w="100"/>
+            </w:tcMar>
+          </w:tcPr>
+          <w:p>
+            <w:pPr>
+              <w:spacing w:line="276"/>
+              <w:jc w:val="left"/>
+            </w:pPr>
+            <w:r>
+              <w:rPr>
+                <w:rFonts w:ascii="Times New Roman" w:cs="Times New Roman" w:eastAsia="Times New Roman" w:hAnsi="Times New Roman"/>
+                <w:b w:val="false"/>
+                <w:bCs w:val="false"/>
+                <w:sz w:val="24"/>
+                <w:szCs w:val="24"/>
+              </w:rPr>
+              <w:t xml:space="preserve">7.1 s</w:t>
+            </w:r>
+          </w:p>
+        </w:tc>
+        <w:tc>
+          <w:tcPr>
+            <w:tcW w:type="dxa" w:w="1326"/>
+            <w:tcBorders>
+              <w:top w:val="single" w:color="000000" w:sz="4"/>
+              <w:left w:val="single" w:color="000000" w:sz="4"/>
+              <w:bottom w:val="single" w:color="000000" w:sz="4"/>
+              <w:right w:val="single" w:color="000000" w:sz="4"/>
+            </w:tcBorders>
+            <w:tcMar>
+              <w:top w:type="dxa" w:w="60"/>
+              <w:left w:type="dxa" w:w="100"/>
+              <w:bottom w:type="dxa" w:w="60"/>
+              <w:right w:type="dxa" w:w="100"/>
+            </w:tcMar>
+          </w:tcPr>
+          <w:p>
+            <w:pPr>
+              <w:spacing w:line="276"/>
+              <w:jc w:val="left"/>
+            </w:pPr>
+            <w:r>
+              <w:rPr>
+                <w:rFonts w:ascii="Times New Roman" w:cs="Times New Roman" w:eastAsia="Times New Roman" w:hAnsi="Times New Roman"/>
+                <w:b w:val="false"/>
+                <w:bCs w:val="false"/>
+                <w:sz w:val="24"/>
+                <w:szCs w:val="24"/>
+              </w:rPr>
+              <w:t xml:space="preserve">8</w:t>
+            </w:r>
+          </w:p>
+        </w:tc>
+      </w:tr>
+    </w:tbl>
+    <w:p>
+      <w:pPr>
+        <w:spacing w:after="160"/>
+      </w:pPr>
+    </w:p>
+    <w:p>
+      <w:pPr>
+        <w:spacing w:after="120" w:line="360"/>
+        <w:jc w:val="both"/>
+      </w:pPr>
+      <w:r>
+        <w:rPr>
+          <w:rFonts w:ascii="Times New Roman" w:cs="Times New Roman" w:eastAsia="Times New Roman" w:hAnsi="Times New Roman"/>
+          <w:sz w:val="24"/>
+          <w:szCs w:val="24"/>
+        </w:rPr>
+        <w:t xml:space="preserve">Polite mode with X = 1.3 brings the share from 70% to about half and the Jain index from 0.86 to 0.94, and it also shortens the competing AIMD flow from 7.8 s to 5.8 s. The price on a single flow is speed: over the 100 random held-out paths the geometric-mean time ratio to tuned AIMD rises from 0.534 to 0.576, the agent is still faster on 89 paths, but 3 paths are now more than 20% slower and the worst is 2.95 times slower (the default has none and 1.13). A first version without the jitter test and the window floor stalled on a high-jitter path (76 s against 25 s for AIMD), which is why those two conditions exist. The mode is therefore off by default. Individual runs vary (the agent's share ranged from 21% to 58% in a four-run check), so the share is an average, not a guarantee.</w:t>
+      </w:r>
+    </w:p>
+    <w:p>
+      <w:pPr>
+        <w:spacing w:after="120" w:line="360"/>
+        <w:jc w:val="both"/>
+      </w:pPr>
+      <w:r>
+        <w:rPr>
+          <w:rFonts w:ascii="Times New Roman" w:cs="Times New Roman" w:eastAsia="Times New Roman" w:hAnsi="Times New Roman"/>
+          <w:b/>
+          <w:bCs/>
+          <w:sz w:val="24"/>
+          <w:szCs w:val="24"/>
+        </w:rPr>
+        <w:t xml:space="preserve">Bursty cross traffic.</w:t>
+      </w:r>
+      <w:r>
+        <w:rPr>
+          <w:rFonts w:ascii="Times New Roman" w:cs="Times New Roman" w:eastAsia="Times New Roman" w:hAnsi="Times New Roman"/>
+          <w:sz w:val="24"/>
+          <w:szCs w:val="24"/>
+        </w:rPr>
+        <w:t xml:space="preserve"> The proxy gained a cross-traffic source (--cross ON:OFF:PPS) that injects exponentially distributed bursts into the same bottleneck (here 300 ms on, 500 ms off, 700 packets per second on a 1,000 packet per second link). One flow of 2,500 packets, 8 paired runs per policy, real sockets:</w:t>
+      </w:r>
+    </w:p>
+    <w:tbl>
+      <w:tblPr>
+        <w:tblW w:type="dxa" w:w="9026"/>
+        <w:tblBorders>
+          <w:top w:val="single" w:color="auto" w:sz="4"/>
+          <w:left w:val="single" w:color="auto" w:sz="4"/>
+          <w:bottom w:val="single" w:color="auto" w:sz="4"/>
+          <w:right w:val="single" w:color="auto" w:sz="4"/>
+          <w:insideH w:val="single" w:color="auto" w:sz="4"/>
+          <w:insideV w:val="single" w:color="auto" w:sz="4"/>
+        </w:tblBorders>
+      </w:tblPr>
+      <w:tblGrid>
+        <w:gridCol w:w="2800"/>
+        <w:gridCol w:w="1500"/>
+        <w:gridCol w:w="1700"/>
+        <w:gridCol w:w="1500"/>
+        <w:gridCol w:w="1526"/>
+      </w:tblGrid>
+      <w:tr>
+        <w:trPr>
+          <w:cantSplit/>
+          <w:tblHeader/>
+        </w:trPr>
+        <w:tc>
+          <w:tcPr>
+            <w:tcW w:type="dxa" w:w="2800"/>
+            <w:tcBorders>
+              <w:top w:val="single" w:color="000000" w:sz="4"/>
+              <w:left w:val="single" w:color="000000" w:sz="4"/>
+              <w:bottom w:val="single" w:color="000000" w:sz="4"/>
+              <w:right w:val="single" w:color="000000" w:sz="4"/>
+            </w:tcBorders>
+            <w:shd w:fill="D9D9D9" w:color="auto" w:val="clear"/>
+            <w:tcMar>
+              <w:top w:type="dxa" w:w="60"/>
+              <w:left w:type="dxa" w:w="100"/>
+              <w:bottom w:type="dxa" w:w="60"/>
+              <w:right w:type="dxa" w:w="100"/>
+            </w:tcMar>
+          </w:tcPr>
+          <w:p>
+            <w:pPr>
+              <w:spacing w:line="276"/>
+              <w:jc w:val="left"/>
+            </w:pPr>
+            <w:r>
+              <w:rPr>
+                <w:rFonts w:ascii="Times New Roman" w:cs="Times New Roman" w:eastAsia="Times New Roman" w:hAnsi="Times New Roman"/>
+                <w:b/>
+                <w:bCs/>
+                <w:sz w:val="24"/>
+                <w:szCs w:val="24"/>
+              </w:rPr>
+              <w:t xml:space="preserve">Policy</w:t>
+            </w:r>
+          </w:p>
+        </w:tc>
+        <w:tc>
+          <w:tcPr>
+            <w:tcW w:type="dxa" w:w="1500"/>
+            <w:tcBorders>
+              <w:top w:val="single" w:color="000000" w:sz="4"/>
+              <w:left w:val="single" w:color="000000" w:sz="4"/>
+              <w:bottom w:val="single" w:color="000000" w:sz="4"/>
+              <w:right w:val="single" w:color="000000" w:sz="4"/>
+            </w:tcBorders>
+            <w:shd w:fill="D9D9D9" w:color="auto" w:val="clear"/>
+            <w:tcMar>
+              <w:top w:type="dxa" w:w="60"/>
+              <w:left w:type="dxa" w:w="100"/>
+              <w:bottom w:type="dxa" w:w="60"/>
+              <w:right w:type="dxa" w:w="100"/>
+            </w:tcMar>
+          </w:tcPr>
+          <w:p>
+            <w:pPr>
+              <w:spacing w:line="276"/>
+              <w:jc w:val="left"/>
+            </w:pPr>
+            <w:r>
+              <w:rPr>
+                <w:rFonts w:ascii="Times New Roman" w:cs="Times New Roman" w:eastAsia="Times New Roman" w:hAnsi="Times New Roman"/>
+                <w:b/>
+                <w:bCs/>
+                <w:sz w:val="24"/>
+                <w:szCs w:val="24"/>
+              </w:rPr>
+              <w:t xml:space="preserve">Time (s)</w:t>
+            </w:r>
+          </w:p>
+        </w:tc>
+        <w:tc>
+          <w:tcPr>
+            <w:tcW w:type="dxa" w:w="1700"/>
+            <w:tcBorders>
+              <w:top w:val="single" w:color="000000" w:sz="4"/>
+              <w:left w:val="single" w:color="000000" w:sz="4"/>
+              <w:bottom w:val="single" w:color="000000" w:sz="4"/>
+              <w:right w:val="single" w:color="000000" w:sz="4"/>
+            </w:tcBorders>
+            <w:shd w:fill="D9D9D9" w:color="auto" w:val="clear"/>
+            <w:tcMar>
+              <w:top w:type="dxa" w:w="60"/>
+              <w:left w:type="dxa" w:w="100"/>
+              <w:bottom w:type="dxa" w:w="60"/>
+              <w:right w:type="dxa" w:w="100"/>
+            </w:tcMar>
+          </w:tcPr>
+          <w:p>
+            <w:pPr>
+              <w:spacing w:line="276"/>
+              <w:jc w:val="left"/>
+            </w:pPr>
+            <w:r>
+              <w:rPr>
+                <w:rFonts w:ascii="Times New Roman" w:cs="Times New Roman" w:eastAsia="Times New Roman" w:hAnsi="Times New Roman"/>
+                <w:b/>
+                <w:bCs/>
+                <w:sz w:val="24"/>
+                <w:szCs w:val="24"/>
+              </w:rPr>
+              <w:t xml:space="preserve">95% interval</w:t>
+            </w:r>
+          </w:p>
+        </w:tc>
+        <w:tc>
+          <w:tcPr>
+            <w:tcW w:type="dxa" w:w="1500"/>
+            <w:tcBorders>
+              <w:top w:val="single" w:color="000000" w:sz="4"/>
+              <w:left w:val="single" w:color="000000" w:sz="4"/>
+              <w:bottom w:val="single" w:color="000000" w:sz="4"/>
+              <w:right w:val="single" w:color="000000" w:sz="4"/>
+            </w:tcBorders>
+            <w:shd w:fill="D9D9D9" w:color="auto" w:val="clear"/>
+            <w:tcMar>
+              <w:top w:type="dxa" w:w="60"/>
+              <w:left w:type="dxa" w:w="100"/>
+              <w:bottom w:type="dxa" w:w="60"/>
+              <w:right w:type="dxa" w:w="100"/>
+            </w:tcMar>
+          </w:tcPr>
+          <w:p>
+            <w:pPr>
+              <w:spacing w:line="276"/>
+              <w:jc w:val="left"/>
+            </w:pPr>
+            <w:r>
+              <w:rPr>
+                <w:rFonts w:ascii="Times New Roman" w:cs="Times New Roman" w:eastAsia="Times New Roman" w:hAnsi="Times New Roman"/>
+                <w:b/>
+                <w:bCs/>
+                <w:sz w:val="24"/>
+                <w:szCs w:val="24"/>
+              </w:rPr>
+              <w:t xml:space="preserve">Ratio to tuned AIMD</w:t>
+            </w:r>
+          </w:p>
+        </w:tc>
+        <w:tc>
+          <w:tcPr>
+            <w:tcW w:type="dxa" w:w="1526"/>
+            <w:tcBorders>
+              <w:top w:val="single" w:color="000000" w:sz="4"/>
+              <w:left w:val="single" w:color="000000" w:sz="4"/>
+              <w:bottom w:val="single" w:color="000000" w:sz="4"/>
+              <w:right w:val="single" w:color="000000" w:sz="4"/>
+            </w:tcBorders>
+            <w:shd w:fill="D9D9D9" w:color="auto" w:val="clear"/>
+            <w:tcMar>
+              <w:top w:type="dxa" w:w="60"/>
+              <w:left w:type="dxa" w:w="100"/>
+              <w:bottom w:type="dxa" w:w="60"/>
+              <w:right w:type="dxa" w:w="100"/>
+            </w:tcMar>
+          </w:tcPr>
+          <w:p>
+            <w:pPr>
+              <w:spacing w:line="276"/>
+              <w:jc w:val="left"/>
+            </w:pPr>
+            <w:r>
+              <w:rPr>
+                <w:rFonts w:ascii="Times New Roman" w:cs="Times New Roman" w:eastAsia="Times New Roman" w:hAnsi="Times New Roman"/>
+                <w:b/>
+                <w:bCs/>
+                <w:sz w:val="24"/>
+                <w:szCs w:val="24"/>
+              </w:rPr>
+              <w:t xml:space="preserve">Retransmissions</w:t>
+            </w:r>
+          </w:p>
+        </w:tc>
+      </w:tr>
+      <w:tr>
+        <w:trPr>
+          <w:cantSplit/>
+          <w:tblHeader w:val="false"/>
+        </w:trPr>
+        <w:tc>
+          <w:tcPr>
+            <w:tcW w:type="dxa" w:w="2800"/>
+            <w:tcBorders>
+              <w:top w:val="single" w:color="000000" w:sz="4"/>
+              <w:left w:val="single" w:color="000000" w:sz="4"/>
+              <w:bottom w:val="single" w:color="000000" w:sz="4"/>
+              <w:right w:val="single" w:color="000000" w:sz="4"/>
+            </w:tcBorders>
+            <w:tcMar>
+              <w:top w:type="dxa" w:w="60"/>
+              <w:left w:type="dxa" w:w="100"/>
+              <w:bottom w:type="dxa" w:w="60"/>
+              <w:right w:type="dxa" w:w="100"/>
+            </w:tcMar>
+          </w:tcPr>
+          <w:p>
+            <w:pPr>
+              <w:spacing w:line="276"/>
+              <w:jc w:val="left"/>
+            </w:pPr>
+            <w:r>
+              <w:rPr>
+                <w:rFonts w:ascii="Times New Roman" w:cs="Times New Roman" w:eastAsia="Times New Roman" w:hAnsi="Times New Roman"/>
+                <w:b w:val="false"/>
+                <w:bCs w:val="false"/>
+                <w:sz w:val="24"/>
+                <w:szCs w:val="24"/>
+              </w:rPr>
+              <w:t xml:space="preserve">AIMD, cap 32</w:t>
+            </w:r>
+          </w:p>
+        </w:tc>
+        <w:tc>
+          <w:tcPr>
+            <w:tcW w:type="dxa" w:w="1500"/>
+            <w:tcBorders>
+              <w:top w:val="single" w:color="000000" w:sz="4"/>
+              <w:left w:val="single" w:color="000000" w:sz="4"/>
+              <w:bottom w:val="single" w:color="000000" w:sz="4"/>
+              <w:right w:val="single" w:color="000000" w:sz="4"/>
+            </w:tcBorders>
+            <w:tcMar>
+              <w:top w:type="dxa" w:w="60"/>
+              <w:left w:type="dxa" w:w="100"/>
+              <w:bottom w:type="dxa" w:w="60"/>
+              <w:right w:type="dxa" w:w="100"/>
+            </w:tcMar>
+          </w:tcPr>
+          <w:p>
+            <w:pPr>
+              <w:spacing w:line="276"/>
+              <w:jc w:val="left"/>
+            </w:pPr>
+            <w:r>
+              <w:rPr>
+                <w:rFonts w:ascii="Times New Roman" w:cs="Times New Roman" w:eastAsia="Times New Roman" w:hAnsi="Times New Roman"/>
+                <w:b w:val="false"/>
+                <w:bCs w:val="false"/>
+                <w:sz w:val="24"/>
+                <w:szCs w:val="24"/>
+              </w:rPr>
+              <w:t xml:space="preserve">6.73</w:t>
+            </w:r>
+          </w:p>
+        </w:tc>
+        <w:tc>
+          <w:tcPr>
+            <w:tcW w:type="dxa" w:w="1700"/>
+            <w:tcBorders>
+              <w:top w:val="single" w:color="000000" w:sz="4"/>
+              <w:left w:val="single" w:color="000000" w:sz="4"/>
+              <w:bottom w:val="single" w:color="000000" w:sz="4"/>
+              <w:right w:val="single" w:color="000000" w:sz="4"/>
+            </w:tcBorders>
+            <w:tcMar>
+              <w:top w:type="dxa" w:w="60"/>
+              <w:left w:type="dxa" w:w="100"/>
+              <w:bottom w:type="dxa" w:w="60"/>
+              <w:right w:type="dxa" w:w="100"/>
+            </w:tcMar>
+          </w:tcPr>
+          <w:p>
+            <w:pPr>
+              <w:spacing w:line="276"/>
+              <w:jc w:val="left"/>
+            </w:pPr>
+            <w:r>
+              <w:rPr>
+                <w:rFonts w:ascii="Times New Roman" w:cs="Times New Roman" w:eastAsia="Times New Roman" w:hAnsi="Times New Roman"/>
+                <w:b w:val="false"/>
+                <w:bCs w:val="false"/>
+                <w:sz w:val="24"/>
+                <w:szCs w:val="24"/>
+              </w:rPr>
+              <w:t xml:space="preserve">+- 0.38</w:t>
+            </w:r>
+          </w:p>
+        </w:tc>
+        <w:tc>
+          <w:tcPr>
+            <w:tcW w:type="dxa" w:w="1500"/>
+            <w:tcBorders>
+              <w:top w:val="single" w:color="000000" w:sz="4"/>
+              <w:left w:val="single" w:color="000000" w:sz="4"/>
+              <w:bottom w:val="single" w:color="000000" w:sz="4"/>
+              <w:right w:val="single" w:color="000000" w:sz="4"/>
+            </w:tcBorders>
+            <w:tcMar>
+              <w:top w:type="dxa" w:w="60"/>
+              <w:left w:type="dxa" w:w="100"/>
+              <w:bottom w:type="dxa" w:w="60"/>
+              <w:right w:type="dxa" w:w="100"/>
+            </w:tcMar>
+          </w:tcPr>
+          <w:p>
+            <w:pPr>
+              <w:spacing w:line="276"/>
+              <w:jc w:val="left"/>
+            </w:pPr>
+            <w:r>
+              <w:rPr>
+                <w:rFonts w:ascii="Times New Roman" w:cs="Times New Roman" w:eastAsia="Times New Roman" w:hAnsi="Times New Roman"/>
+                <w:b w:val="false"/>
+                <w:bCs w:val="false"/>
+                <w:sz w:val="24"/>
+                <w:szCs w:val="24"/>
+              </w:rPr>
+              <w:t xml:space="preserve">1.18</w:t>
+            </w:r>
+          </w:p>
+        </w:tc>
+        <w:tc>
+          <w:tcPr>
+            <w:tcW w:type="dxa" w:w="1526"/>
+            <w:tcBorders>
+              <w:top w:val="single" w:color="000000" w:sz="4"/>
+              <w:left w:val="single" w:color="000000" w:sz="4"/>
+              <w:bottom w:val="single" w:color="000000" w:sz="4"/>
+              <w:right w:val="single" w:color="000000" w:sz="4"/>
+            </w:tcBorders>
+            <w:tcMar>
+              <w:top w:type="dxa" w:w="60"/>
+              <w:left w:type="dxa" w:w="100"/>
+              <w:bottom w:type="dxa" w:w="60"/>
+              <w:right w:type="dxa" w:w="100"/>
+            </w:tcMar>
+          </w:tcPr>
+          <w:p>
+            <w:pPr>
+              <w:spacing w:line="276"/>
+              <w:jc w:val="left"/>
+            </w:pPr>
+            <w:r>
+              <w:rPr>
+                <w:rFonts w:ascii="Times New Roman" w:cs="Times New Roman" w:eastAsia="Times New Roman" w:hAnsi="Times New Roman"/>
+                <w:b w:val="false"/>
+                <w:bCs w:val="false"/>
+                <w:sz w:val="24"/>
+                <w:szCs w:val="24"/>
+              </w:rPr>
+              <w:t xml:space="preserve">3</w:t>
+            </w:r>
+          </w:p>
+        </w:tc>
+      </w:tr>
+      <w:tr>
+        <w:trPr>
+          <w:cantSplit/>
+          <w:tblHeader w:val="false"/>
+        </w:trPr>
+        <w:tc>
+          <w:tcPr>
+            <w:tcW w:type="dxa" w:w="2800"/>
+            <w:tcBorders>
+              <w:top w:val="single" w:color="000000" w:sz="4"/>
+              <w:left w:val="single" w:color="000000" w:sz="4"/>
+              <w:bottom w:val="single" w:color="000000" w:sz="4"/>
+              <w:right w:val="single" w:color="000000" w:sz="4"/>
+            </w:tcBorders>
+            <w:tcMar>
+              <w:top w:type="dxa" w:w="60"/>
+              <w:left w:type="dxa" w:w="100"/>
+              <w:bottom w:type="dxa" w:w="60"/>
+              <w:right w:type="dxa" w:w="100"/>
+            </w:tcMar>
+          </w:tcPr>
+          <w:p>
+            <w:pPr>
+              <w:spacing w:line="276"/>
+              <w:jc w:val="left"/>
+            </w:pPr>
+            <w:r>
+              <w:rPr>
+                <w:rFonts w:ascii="Times New Roman" w:cs="Times New Roman" w:eastAsia="Times New Roman" w:hAnsi="Times New Roman"/>
+                <w:b w:val="false"/>
+                <w:bCs w:val="false"/>
+                <w:sz w:val="24"/>
+                <w:szCs w:val="24"/>
+              </w:rPr>
+              <w:t xml:space="preserve">AIMD, tuned</w:t>
+            </w:r>
+          </w:p>
+        </w:tc>
+        <w:tc>
+          <w:tcPr>
+            <w:tcW w:type="dxa" w:w="1500"/>
+            <w:tcBorders>
+              <w:top w:val="single" w:color="000000" w:sz="4"/>
+              <w:left w:val="single" w:color="000000" w:sz="4"/>
+              <w:bottom w:val="single" w:color="000000" w:sz="4"/>
+              <w:right w:val="single" w:color="000000" w:sz="4"/>
+            </w:tcBorders>
+            <w:tcMar>
+              <w:top w:type="dxa" w:w="60"/>
+              <w:left w:type="dxa" w:w="100"/>
+              <w:bottom w:type="dxa" w:w="60"/>
+              <w:right w:type="dxa" w:w="100"/>
+            </w:tcMar>
+          </w:tcPr>
+          <w:p>
+            <w:pPr>
+              <w:spacing w:line="276"/>
+              <w:jc w:val="left"/>
+            </w:pPr>
+            <w:r>
+              <w:rPr>
+                <w:rFonts w:ascii="Times New Roman" w:cs="Times New Roman" w:eastAsia="Times New Roman" w:hAnsi="Times New Roman"/>
+                <w:b w:val="false"/>
+                <w:bCs w:val="false"/>
+                <w:sz w:val="24"/>
+                <w:szCs w:val="24"/>
+              </w:rPr>
+              <w:t xml:space="preserve">5.73</w:t>
+            </w:r>
+          </w:p>
+        </w:tc>
+        <w:tc>
+          <w:tcPr>
+            <w:tcW w:type="dxa" w:w="1700"/>
+            <w:tcBorders>
+              <w:top w:val="single" w:color="000000" w:sz="4"/>
+              <w:left w:val="single" w:color="000000" w:sz="4"/>
+              <w:bottom w:val="single" w:color="000000" w:sz="4"/>
+              <w:right w:val="single" w:color="000000" w:sz="4"/>
+            </w:tcBorders>
+            <w:tcMar>
+              <w:top w:type="dxa" w:w="60"/>
+              <w:left w:type="dxa" w:w="100"/>
+              <w:bottom w:type="dxa" w:w="60"/>
+              <w:right w:type="dxa" w:w="100"/>
+            </w:tcMar>
+          </w:tcPr>
+          <w:p>
+            <w:pPr>
+              <w:spacing w:line="276"/>
+              <w:jc w:val="left"/>
+            </w:pPr>
+            <w:r>
+              <w:rPr>
+                <w:rFonts w:ascii="Times New Roman" w:cs="Times New Roman" w:eastAsia="Times New Roman" w:hAnsi="Times New Roman"/>
+                <w:b w:val="false"/>
+                <w:bCs w:val="false"/>
+                <w:sz w:val="24"/>
+                <w:szCs w:val="24"/>
+              </w:rPr>
+              <w:t xml:space="preserve">+- 0.51</w:t>
+            </w:r>
+          </w:p>
+        </w:tc>
+        <w:tc>
+          <w:tcPr>
+            <w:tcW w:type="dxa" w:w="1500"/>
+            <w:tcBorders>
+              <w:top w:val="single" w:color="000000" w:sz="4"/>
+              <w:left w:val="single" w:color="000000" w:sz="4"/>
+              <w:bottom w:val="single" w:color="000000" w:sz="4"/>
+              <w:right w:val="single" w:color="000000" w:sz="4"/>
+            </w:tcBorders>
+            <w:tcMar>
+              <w:top w:type="dxa" w:w="60"/>
+              <w:left w:type="dxa" w:w="100"/>
+              <w:bottom w:type="dxa" w:w="60"/>
+              <w:right w:type="dxa" w:w="100"/>
+            </w:tcMar>
+          </w:tcPr>
+          <w:p>
+            <w:pPr>
+              <w:spacing w:line="276"/>
+              <w:jc w:val="left"/>
+            </w:pPr>
+            <w:r>
+              <w:rPr>
+                <w:rFonts w:ascii="Times New Roman" w:cs="Times New Roman" w:eastAsia="Times New Roman" w:hAnsi="Times New Roman"/>
+                <w:b w:val="false"/>
+                <w:bCs w:val="false"/>
+                <w:sz w:val="24"/>
+                <w:szCs w:val="24"/>
+              </w:rPr>
+              <w:t xml:space="preserve">1.00</w:t>
+            </w:r>
+          </w:p>
+        </w:tc>
+        <w:tc>
+          <w:tcPr>
+            <w:tcW w:type="dxa" w:w="1526"/>
+            <w:tcBorders>
+              <w:top w:val="single" w:color="000000" w:sz="4"/>
+              <w:left w:val="single" w:color="000000" w:sz="4"/>
+              <w:bottom w:val="single" w:color="000000" w:sz="4"/>
+              <w:right w:val="single" w:color="000000" w:sz="4"/>
+            </w:tcBorders>
+            <w:tcMar>
+              <w:top w:type="dxa" w:w="60"/>
+              <w:left w:type="dxa" w:w="100"/>
+              <w:bottom w:type="dxa" w:w="60"/>
+              <w:right w:type="dxa" w:w="100"/>
+            </w:tcMar>
+          </w:tcPr>
+          <w:p>
+            <w:pPr>
+              <w:spacing w:line="276"/>
+              <w:jc w:val="left"/>
+            </w:pPr>
+            <w:r>
+              <w:rPr>
+                <w:rFonts w:ascii="Times New Roman" w:cs="Times New Roman" w:eastAsia="Times New Roman" w:hAnsi="Times New Roman"/>
+                <w:b w:val="false"/>
+                <w:bCs w:val="false"/>
+                <w:sz w:val="24"/>
+                <w:szCs w:val="24"/>
+              </w:rPr>
+              <w:t xml:space="preserve">70</w:t>
+            </w:r>
+          </w:p>
+        </w:tc>
+      </w:tr>
+      <w:tr>
+        <w:trPr>
+          <w:cantSplit/>
+          <w:tblHeader w:val="false"/>
+        </w:trPr>
+        <w:tc>
+          <w:tcPr>
+            <w:tcW w:type="dxa" w:w="2800"/>
+            <w:tcBorders>
+              <w:top w:val="single" w:color="000000" w:sz="4"/>
+              <w:left w:val="single" w:color="000000" w:sz="4"/>
+              <w:bottom w:val="single" w:color="000000" w:sz="4"/>
+              <w:right w:val="single" w:color="000000" w:sz="4"/>
+            </w:tcBorders>
+            <w:tcMar>
+              <w:top w:type="dxa" w:w="60"/>
+              <w:left w:type="dxa" w:w="100"/>
+              <w:bottom w:type="dxa" w:w="60"/>
+              <w:right w:type="dxa" w:w="100"/>
+            </w:tcMar>
+          </w:tcPr>
+          <w:p>
+            <w:pPr>
+              <w:spacing w:line="276"/>
+              <w:jc w:val="left"/>
+            </w:pPr>
+            <w:r>
+              <w:rPr>
+                <w:rFonts w:ascii="Times New Roman" w:cs="Times New Roman" w:eastAsia="Times New Roman" w:hAnsi="Times New Roman"/>
+                <w:b w:val="false"/>
+                <w:bCs w:val="false"/>
+                <w:sz w:val="24"/>
+                <w:szCs w:val="24"/>
+              </w:rPr>
+              <w:t xml:space="preserve">CUBIC, tuned</w:t>
+            </w:r>
+          </w:p>
+        </w:tc>
+        <w:tc>
+          <w:tcPr>
+            <w:tcW w:type="dxa" w:w="1500"/>
+            <w:tcBorders>
+              <w:top w:val="single" w:color="000000" w:sz="4"/>
+              <w:left w:val="single" w:color="000000" w:sz="4"/>
+              <w:bottom w:val="single" w:color="000000" w:sz="4"/>
+              <w:right w:val="single" w:color="000000" w:sz="4"/>
+            </w:tcBorders>
+            <w:tcMar>
+              <w:top w:type="dxa" w:w="60"/>
+              <w:left w:type="dxa" w:w="100"/>
+              <w:bottom w:type="dxa" w:w="60"/>
+              <w:right w:type="dxa" w:w="100"/>
+            </w:tcMar>
+          </w:tcPr>
+          <w:p>
+            <w:pPr>
+              <w:spacing w:line="276"/>
+              <w:jc w:val="left"/>
+            </w:pPr>
+            <w:r>
+              <w:rPr>
+                <w:rFonts w:ascii="Times New Roman" w:cs="Times New Roman" w:eastAsia="Times New Roman" w:hAnsi="Times New Roman"/>
+                <w:b w:val="false"/>
+                <w:bCs w:val="false"/>
+                <w:sz w:val="24"/>
+                <w:szCs w:val="24"/>
+              </w:rPr>
+              <w:t xml:space="preserve">4.55</w:t>
+            </w:r>
+          </w:p>
+        </w:tc>
+        <w:tc>
+          <w:tcPr>
+            <w:tcW w:type="dxa" w:w="1700"/>
+            <w:tcBorders>
+              <w:top w:val="single" w:color="000000" w:sz="4"/>
+              <w:left w:val="single" w:color="000000" w:sz="4"/>
+              <w:bottom w:val="single" w:color="000000" w:sz="4"/>
+              <w:right w:val="single" w:color="000000" w:sz="4"/>
+            </w:tcBorders>
+            <w:tcMar>
+              <w:top w:type="dxa" w:w="60"/>
+              <w:left w:type="dxa" w:w="100"/>
+              <w:bottom w:type="dxa" w:w="60"/>
+              <w:right w:type="dxa" w:w="100"/>
+            </w:tcMar>
+          </w:tcPr>
+          <w:p>
+            <w:pPr>
+              <w:spacing w:line="276"/>
+              <w:jc w:val="left"/>
+            </w:pPr>
+            <w:r>
+              <w:rPr>
+                <w:rFonts w:ascii="Times New Roman" w:cs="Times New Roman" w:eastAsia="Times New Roman" w:hAnsi="Times New Roman"/>
+                <w:b w:val="false"/>
+                <w:bCs w:val="false"/>
+                <w:sz w:val="24"/>
+                <w:szCs w:val="24"/>
+              </w:rPr>
+              <w:t xml:space="preserve">+- 0.60</w:t>
+            </w:r>
+          </w:p>
+        </w:tc>
+        <w:tc>
+          <w:tcPr>
+            <w:tcW w:type="dxa" w:w="1500"/>
+            <w:tcBorders>
+              <w:top w:val="single" w:color="000000" w:sz="4"/>
+              <w:left w:val="single" w:color="000000" w:sz="4"/>
+              <w:bottom w:val="single" w:color="000000" w:sz="4"/>
+              <w:right w:val="single" w:color="000000" w:sz="4"/>
+            </w:tcBorders>
+            <w:tcMar>
+              <w:top w:type="dxa" w:w="60"/>
+              <w:left w:type="dxa" w:w="100"/>
+              <w:bottom w:type="dxa" w:w="60"/>
+              <w:right w:type="dxa" w:w="100"/>
+            </w:tcMar>
+          </w:tcPr>
+          <w:p>
+            <w:pPr>
+              <w:spacing w:line="276"/>
+              <w:jc w:val="left"/>
+            </w:pPr>
+            <w:r>
+              <w:rPr>
+                <w:rFonts w:ascii="Times New Roman" w:cs="Times New Roman" w:eastAsia="Times New Roman" w:hAnsi="Times New Roman"/>
+                <w:b w:val="false"/>
+                <w:bCs w:val="false"/>
+                <w:sz w:val="24"/>
+                <w:szCs w:val="24"/>
+              </w:rPr>
+              <w:t xml:space="preserve">0.79</w:t>
+            </w:r>
+          </w:p>
+        </w:tc>
+        <w:tc>
+          <w:tcPr>
+            <w:tcW w:type="dxa" w:w="1526"/>
+            <w:tcBorders>
+              <w:top w:val="single" w:color="000000" w:sz="4"/>
+              <w:left w:val="single" w:color="000000" w:sz="4"/>
+              <w:bottom w:val="single" w:color="000000" w:sz="4"/>
+              <w:right w:val="single" w:color="000000" w:sz="4"/>
+            </w:tcBorders>
+            <w:tcMar>
+              <w:top w:type="dxa" w:w="60"/>
+              <w:left w:type="dxa" w:w="100"/>
+              <w:bottom w:type="dxa" w:w="60"/>
+              <w:right w:type="dxa" w:w="100"/>
+            </w:tcMar>
+          </w:tcPr>
+          <w:p>
+            <w:pPr>
+              <w:spacing w:line="276"/>
+              <w:jc w:val="left"/>
+            </w:pPr>
+            <w:r>
+              <w:rPr>
+                <w:rFonts w:ascii="Times New Roman" w:cs="Times New Roman" w:eastAsia="Times New Roman" w:hAnsi="Times New Roman"/>
+                <w:b w:val="false"/>
+                <w:bCs w:val="false"/>
+                <w:sz w:val="24"/>
+                <w:szCs w:val="24"/>
+              </w:rPr>
+              <w:t xml:space="preserve">98</w:t>
+            </w:r>
+          </w:p>
+        </w:tc>
+      </w:tr>
+      <w:tr>
+        <w:trPr>
+          <w:cantSplit/>
+          <w:tblHeader w:val="false"/>
+        </w:trPr>
+        <w:tc>
+          <w:tcPr>
+            <w:tcW w:type="dxa" w:w="2800"/>
+            <w:tcBorders>
+              <w:top w:val="single" w:color="000000" w:sz="4"/>
+              <w:left w:val="single" w:color="000000" w:sz="4"/>
+              <w:bottom w:val="single" w:color="000000" w:sz="4"/>
+              <w:right w:val="single" w:color="000000" w:sz="4"/>
+            </w:tcBorders>
+            <w:tcMar>
+              <w:top w:type="dxa" w:w="60"/>
+              <w:left w:type="dxa" w:w="100"/>
+              <w:bottom w:type="dxa" w:w="60"/>
+              <w:right w:type="dxa" w:w="100"/>
+            </w:tcMar>
+          </w:tcPr>
+          <w:p>
+            <w:pPr>
+              <w:spacing w:line="276"/>
+              <w:jc w:val="left"/>
+            </w:pPr>
+            <w:r>
+              <w:rPr>
+                <w:rFonts w:ascii="Times New Roman" w:cs="Times New Roman" w:eastAsia="Times New Roman" w:hAnsi="Times New Roman"/>
+                <w:b w:val="false"/>
+                <w:bCs w:val="false"/>
+                <w:sz w:val="24"/>
+                <w:szCs w:val="24"/>
+              </w:rPr>
+              <w:t xml:space="preserve">Neural agent</w:t>
+            </w:r>
+          </w:p>
+        </w:tc>
+        <w:tc>
+          <w:tcPr>
+            <w:tcW w:type="dxa" w:w="1500"/>
+            <w:tcBorders>
+              <w:top w:val="single" w:color="000000" w:sz="4"/>
+              <w:left w:val="single" w:color="000000" w:sz="4"/>
+              <w:bottom w:val="single" w:color="000000" w:sz="4"/>
+              <w:right w:val="single" w:color="000000" w:sz="4"/>
+            </w:tcBorders>
+            <w:tcMar>
+              <w:top w:type="dxa" w:w="60"/>
+              <w:left w:type="dxa" w:w="100"/>
+              <w:bottom w:type="dxa" w:w="60"/>
+              <w:right w:type="dxa" w:w="100"/>
+            </w:tcMar>
+          </w:tcPr>
+          <w:p>
+            <w:pPr>
+              <w:spacing w:line="276"/>
+              <w:jc w:val="left"/>
+            </w:pPr>
+            <w:r>
+              <w:rPr>
+                <w:rFonts w:ascii="Times New Roman" w:cs="Times New Roman" w:eastAsia="Times New Roman" w:hAnsi="Times New Roman"/>
+                <w:b w:val="false"/>
+                <w:bCs w:val="false"/>
+                <w:sz w:val="24"/>
+                <w:szCs w:val="24"/>
+              </w:rPr>
+              <w:t xml:space="preserve">4.87</w:t>
+            </w:r>
+          </w:p>
+        </w:tc>
+        <w:tc>
+          <w:tcPr>
+            <w:tcW w:type="dxa" w:w="1700"/>
+            <w:tcBorders>
+              <w:top w:val="single" w:color="000000" w:sz="4"/>
+              <w:left w:val="single" w:color="000000" w:sz="4"/>
+              <w:bottom w:val="single" w:color="000000" w:sz="4"/>
+              <w:right w:val="single" w:color="000000" w:sz="4"/>
+            </w:tcBorders>
+            <w:tcMar>
+              <w:top w:type="dxa" w:w="60"/>
+              <w:left w:type="dxa" w:w="100"/>
+              <w:bottom w:type="dxa" w:w="60"/>
+              <w:right w:type="dxa" w:w="100"/>
+            </w:tcMar>
+          </w:tcPr>
+          <w:p>
+            <w:pPr>
+              <w:spacing w:line="276"/>
+              <w:jc w:val="left"/>
+            </w:pPr>
+            <w:r>
+              <w:rPr>
+                <w:rFonts w:ascii="Times New Roman" w:cs="Times New Roman" w:eastAsia="Times New Roman" w:hAnsi="Times New Roman"/>
+                <w:b w:val="false"/>
+                <w:bCs w:val="false"/>
+                <w:sz w:val="24"/>
+                <w:szCs w:val="24"/>
+              </w:rPr>
+              <w:t xml:space="preserve">+- 0.37</w:t>
+            </w:r>
+          </w:p>
+        </w:tc>
+        <w:tc>
+          <w:tcPr>
+            <w:tcW w:type="dxa" w:w="1500"/>
+            <w:tcBorders>
+              <w:top w:val="single" w:color="000000" w:sz="4"/>
+              <w:left w:val="single" w:color="000000" w:sz="4"/>
+              <w:bottom w:val="single" w:color="000000" w:sz="4"/>
+              <w:right w:val="single" w:color="000000" w:sz="4"/>
+            </w:tcBorders>
+            <w:tcMar>
+              <w:top w:type="dxa" w:w="60"/>
+              <w:left w:type="dxa" w:w="100"/>
+              <w:bottom w:type="dxa" w:w="60"/>
+              <w:right w:type="dxa" w:w="100"/>
+            </w:tcMar>
+          </w:tcPr>
+          <w:p>
+            <w:pPr>
+              <w:spacing w:line="276"/>
+              <w:jc w:val="left"/>
+            </w:pPr>
+            <w:r>
+              <w:rPr>
+                <w:rFonts w:ascii="Times New Roman" w:cs="Times New Roman" w:eastAsia="Times New Roman" w:hAnsi="Times New Roman"/>
+                <w:b w:val="false"/>
+                <w:bCs w:val="false"/>
+                <w:sz w:val="24"/>
+                <w:szCs w:val="24"/>
+              </w:rPr>
+              <w:t xml:space="preserve">0.85</w:t>
+            </w:r>
+          </w:p>
+        </w:tc>
+        <w:tc>
+          <w:tcPr>
+            <w:tcW w:type="dxa" w:w="1526"/>
+            <w:tcBorders>
+              <w:top w:val="single" w:color="000000" w:sz="4"/>
+              <w:left w:val="single" w:color="000000" w:sz="4"/>
+              <w:bottom w:val="single" w:color="000000" w:sz="4"/>
+              <w:right w:val="single" w:color="000000" w:sz="4"/>
+            </w:tcBorders>
+            <w:tcMar>
+              <w:top w:type="dxa" w:w="60"/>
+              <w:left w:type="dxa" w:w="100"/>
+              <w:bottom w:type="dxa" w:w="60"/>
+              <w:right w:type="dxa" w:w="100"/>
+            </w:tcMar>
+          </w:tcPr>
+          <w:p>
+            <w:pPr>
+              <w:spacing w:line="276"/>
+              <w:jc w:val="left"/>
+            </w:pPr>
+            <w:r>
+              <w:rPr>
+                <w:rFonts w:ascii="Times New Roman" w:cs="Times New Roman" w:eastAsia="Times New Roman" w:hAnsi="Times New Roman"/>
+                <w:b w:val="false"/>
+                <w:bCs w:val="false"/>
+                <w:sz w:val="24"/>
+                <w:szCs w:val="24"/>
+              </w:rPr>
+              <w:t xml:space="preserve">200</w:t>
+            </w:r>
+          </w:p>
+        </w:tc>
+      </w:tr>
+      <w:tr>
+        <w:trPr>
+          <w:cantSplit/>
+          <w:tblHeader w:val="false"/>
+        </w:trPr>
+        <w:tc>
+          <w:tcPr>
+            <w:tcW w:type="dxa" w:w="2800"/>
+            <w:tcBorders>
+              <w:top w:val="single" w:color="000000" w:sz="4"/>
+              <w:left w:val="single" w:color="000000" w:sz="4"/>
+              <w:bottom w:val="single" w:color="000000" w:sz="4"/>
+              <w:right w:val="single" w:color="000000" w:sz="4"/>
+            </w:tcBorders>
+            <w:tcMar>
+              <w:top w:type="dxa" w:w="60"/>
+              <w:left w:type="dxa" w:w="100"/>
+              <w:bottom w:type="dxa" w:w="60"/>
+              <w:right w:type="dxa" w:w="100"/>
+            </w:tcMar>
+          </w:tcPr>
+          <w:p>
+            <w:pPr>
+              <w:spacing w:line="276"/>
+              <w:jc w:val="left"/>
+            </w:pPr>
+            <w:r>
+              <w:rPr>
+                <w:rFonts w:ascii="Times New Roman" w:cs="Times New Roman" w:eastAsia="Times New Roman" w:hAnsi="Times New Roman"/>
+                <w:b w:val="false"/>
+                <w:bCs w:val="false"/>
+                <w:sz w:val="24"/>
+                <w:szCs w:val="24"/>
+              </w:rPr>
+              <w:t xml:space="preserve">Neural agent, polite 1.3</w:t>
+            </w:r>
+          </w:p>
+        </w:tc>
+        <w:tc>
+          <w:tcPr>
+            <w:tcW w:type="dxa" w:w="1500"/>
+            <w:tcBorders>
+              <w:top w:val="single" w:color="000000" w:sz="4"/>
+              <w:left w:val="single" w:color="000000" w:sz="4"/>
+              <w:bottom w:val="single" w:color="000000" w:sz="4"/>
+              <w:right w:val="single" w:color="000000" w:sz="4"/>
+            </w:tcBorders>
+            <w:tcMar>
+              <w:top w:type="dxa" w:w="60"/>
+              <w:left w:type="dxa" w:w="100"/>
+              <w:bottom w:type="dxa" w:w="60"/>
+              <w:right w:type="dxa" w:w="100"/>
+            </w:tcMar>
+          </w:tcPr>
+          <w:p>
+            <w:pPr>
+              <w:spacing w:line="276"/>
+              <w:jc w:val="left"/>
+            </w:pPr>
+            <w:r>
+              <w:rPr>
+                <w:rFonts w:ascii="Times New Roman" w:cs="Times New Roman" w:eastAsia="Times New Roman" w:hAnsi="Times New Roman"/>
+                <w:b w:val="false"/>
+                <w:bCs w:val="false"/>
+                <w:sz w:val="24"/>
+                <w:szCs w:val="24"/>
+              </w:rPr>
+              <w:t xml:space="preserve">4.92</w:t>
+            </w:r>
+          </w:p>
+        </w:tc>
+        <w:tc>
+          <w:tcPr>
+            <w:tcW w:type="dxa" w:w="1700"/>
+            <w:tcBorders>
+              <w:top w:val="single" w:color="000000" w:sz="4"/>
+              <w:left w:val="single" w:color="000000" w:sz="4"/>
+              <w:bottom w:val="single" w:color="000000" w:sz="4"/>
+              <w:right w:val="single" w:color="000000" w:sz="4"/>
+            </w:tcBorders>
+            <w:tcMar>
+              <w:top w:type="dxa" w:w="60"/>
+              <w:left w:type="dxa" w:w="100"/>
+              <w:bottom w:type="dxa" w:w="60"/>
+              <w:right w:type="dxa" w:w="100"/>
+            </w:tcMar>
+          </w:tcPr>
+          <w:p>
+            <w:pPr>
+              <w:spacing w:line="276"/>
+              <w:jc w:val="left"/>
+            </w:pPr>
+            <w:r>
+              <w:rPr>
+                <w:rFonts w:ascii="Times New Roman" w:cs="Times New Roman" w:eastAsia="Times New Roman" w:hAnsi="Times New Roman"/>
+                <w:b w:val="false"/>
+                <w:bCs w:val="false"/>
+                <w:sz w:val="24"/>
+                <w:szCs w:val="24"/>
+              </w:rPr>
+              <w:t xml:space="preserve">+- 0.54</w:t>
+            </w:r>
+          </w:p>
+        </w:tc>
+        <w:tc>
+          <w:tcPr>
+            <w:tcW w:type="dxa" w:w="1500"/>
+            <w:tcBorders>
+              <w:top w:val="single" w:color="000000" w:sz="4"/>
+              <w:left w:val="single" w:color="000000" w:sz="4"/>
+              <w:bottom w:val="single" w:color="000000" w:sz="4"/>
+              <w:right w:val="single" w:color="000000" w:sz="4"/>
+            </w:tcBorders>
+            <w:tcMar>
+              <w:top w:type="dxa" w:w="60"/>
+              <w:left w:type="dxa" w:w="100"/>
+              <w:bottom w:type="dxa" w:w="60"/>
+              <w:right w:type="dxa" w:w="100"/>
+            </w:tcMar>
+          </w:tcPr>
+          <w:p>
+            <w:pPr>
+              <w:spacing w:line="276"/>
+              <w:jc w:val="left"/>
+            </w:pPr>
+            <w:r>
+              <w:rPr>
+                <w:rFonts w:ascii="Times New Roman" w:cs="Times New Roman" w:eastAsia="Times New Roman" w:hAnsi="Times New Roman"/>
+                <w:b w:val="false"/>
+                <w:bCs w:val="false"/>
+                <w:sz w:val="24"/>
+                <w:szCs w:val="24"/>
+              </w:rPr>
+              <w:t xml:space="preserve">0.86</w:t>
+            </w:r>
+          </w:p>
+        </w:tc>
+        <w:tc>
+          <w:tcPr>
+            <w:tcW w:type="dxa" w:w="1526"/>
+            <w:tcBorders>
+              <w:top w:val="single" w:color="000000" w:sz="4"/>
+              <w:left w:val="single" w:color="000000" w:sz="4"/>
+              <w:bottom w:val="single" w:color="000000" w:sz="4"/>
+              <w:right w:val="single" w:color="000000" w:sz="4"/>
+            </w:tcBorders>
+            <w:tcMar>
+              <w:top w:type="dxa" w:w="60"/>
+              <w:left w:type="dxa" w:w="100"/>
+              <w:bottom w:type="dxa" w:w="60"/>
+              <w:right w:type="dxa" w:w="100"/>
+            </w:tcMar>
+          </w:tcPr>
+          <w:p>
+            <w:pPr>
+              <w:spacing w:line="276"/>
+              <w:jc w:val="left"/>
+            </w:pPr>
+            <w:r>
+              <w:rPr>
+                <w:rFonts w:ascii="Times New Roman" w:cs="Times New Roman" w:eastAsia="Times New Roman" w:hAnsi="Times New Roman"/>
+                <w:b w:val="false"/>
+                <w:bCs w:val="false"/>
+                <w:sz w:val="24"/>
+                <w:szCs w:val="24"/>
+              </w:rPr>
+              <w:t xml:space="preserve">151</w:t>
+            </w:r>
+          </w:p>
+        </w:tc>
+      </w:tr>
+    </w:tbl>
+    <w:p>
+      <w:pPr>
+        <w:spacing w:after="160"/>
+      </w:pPr>
+    </w:p>
+    <w:p>
+      <w:pPr>
+        <w:spacing w:after="120" w:line="360"/>
+        <w:jc w:val="both"/>
+      </w:pPr>
+      <w:r>
+        <w:rPr>
+          <w:rFonts w:ascii="Times New Roman" w:cs="Times New Roman" w:eastAsia="Times New Roman" w:hAnsi="Times New Roman"/>
+          <w:sz w:val="24"/>
+          <w:szCs w:val="24"/>
+        </w:rPr>
+        <w:t xml:space="preserve">This is a less favourable result than the clean paths. The agent is about 15% faster than tuned AIMD, but it is not distinguishable from CUBIC, whose interval overlaps, and it retransmits about three times as often as tuned AIMD (200 against 70 packets of 2,500) because bursts overflow the queue while the window is large. Three attempts to reduce this (a window cut of 0.7 or 0.5 on a timeout, and handing over to AIMD at 3% loss instead of 10%) all gave 4.8 to 4.9 s, so none was adopted. The claim that the agent is much better than tuned AIMD should therefore be limited to the paths without competing bursts; with them, a simple CUBIC is as good.</w:t>
+      </w:r>
+    </w:p>
+    <w:p>
+      <w:pPr>
+        <w:spacing w:after="120" w:line="360"/>
+        <w:jc w:val="both"/>
+      </w:pPr>
+      <w:r>
+        <w:rPr>
+          <w:rFonts w:ascii="Times New Roman" w:cs="Times New Roman" w:eastAsia="Times New Roman" w:hAnsi="Times New Roman"/>
+          <w:b/>
+          <w:bCs/>
+          <w:sz w:val="24"/>
+          <w:szCs w:val="24"/>
+        </w:rPr>
+        <w:t xml:space="preserve">Multi-client server.</w:t>
+      </w:r>
+      <w:r>
+        <w:rPr>
+          <w:rFonts w:ascii="Times New Roman" w:cs="Times New Roman" w:eastAsia="Times New Roman" w:hAnsi="Times New Roman"/>
+          <w:sz w:val="24"/>
+          <w:szCs w:val="24"/>
+        </w:rPr>
+        <w:t xml:space="preserve"> The server keeps one session per client address (up to 16 at once, the least recently active is recycled), so several senders can use one server process; a retransmitted FIN after the connection closed is now acknowledged again. A regression test sends two files from two senders at the same time and checks that both arrive byte-identical (tests/test_multiclient.sh, part of make test).</w:t>
+      </w:r>
+    </w:p>
+    <w:p>
+      <w:pPr>
         <w:pStyle w:val="Heading1"/>
         <w:keepNext/>
         <w:spacing w:after="120" w:before="240" w:line="360"/>
@@ -36687,7 +39124,7 @@
           <w:sz w:val="24"/>
           <w:szCs w:val="24"/>
         </w:rPr>
-        <w:t xml:space="preserve">Not a polite neighbour.</w:t>
+        <w:t xml:space="preserve">Not a polite neighbour by default.</w:t>
       </w:r>
       <w:r>
         <w:rPr>
@@ -36695,7 +39132,7 @@
           <w:sz w:val="24"/>
           <w:szCs w:val="24"/>
         </w:rPr>
-        <w:t xml:space="preserve"> On a shared bottleneck the neural agent takes 68% of the link against tuned AIMD and 76% against the original AIMD (Section 8.13). It was not trained for fairness and its coexistence with TCP was not tested.</w:t>
+        <w:t xml:space="preserve"> On a shared bottleneck the neural agent takes 68% to 70% of the link against tuned AIMD and 76% against the original AIMD (Sections 8.13 and 8.15). The optional polite mode brings this to about half, at a cost in speed and with one path 2.95 times slower; it is a rule added by hand, not something the agent learned, and coexistence with kernel TCP was not tested.</w:t>
       </w:r>
     </w:p>
     <w:p>
@@ -36753,7 +39190,7 @@
           <w:sz w:val="24"/>
           <w:szCs w:val="24"/>
         </w:rPr>
-        <w:t xml:space="preserve"> The agent was trained in a Python simulator for windows up to 32; it generalises to a cap of 128 and to the C sender (Section 8.12), and an evolution-strategy fine-tune in the C sender gave no robust gain, but it has never seen a real network trace or a path with cross traffic.</w:t>
+        <w:t xml:space="preserve"> The agent was trained in a Python simulator for windows up to 32; it generalises to a cap of 128 and to the C sender (Section 8.12), and an evolution-strategy fine-tune in the C sender gave no robust gain, but it has never seen a real network trace. With bursty cross traffic (Section 8.15) its advantage over tuned AIMD shrinks to about 15% and it is level with CUBIC.</w:t>
       </w:r>
     </w:p>
     <w:p>
@@ -36782,7 +39219,7 @@
           <w:sz w:val="24"/>
           <w:szCs w:val="24"/>
         </w:rPr>
-        <w:t xml:space="preserve"> Payloads are at most 512 bytes and file mode is limited to 32 MB; one connection per server process; flow control is only the 256-packet receive window; there is no encryption, multiplexing or connection migration (QUIC provides these).</w:t>
+        <w:t xml:space="preserve"> Payloads are at most 512 bytes and file mode is limited to 32 MB; the server handles up to 16 clients at once but each only one connection; flow control is only the 256-packet receive window; there is no encryption, multiplexing or connection migration (QUIC provides these).</w:t>
       </w:r>
     </w:p>
     <w:p>
@@ -36922,7 +39359,7 @@
           <w:sz w:val="24"/>
           <w:szCs w:val="24"/>
         </w:rPr>
-        <w:t xml:space="preserve">Making the agent a fairer neighbour: add a competing flow to the training environment and a fairness term to the objective, then test coexistence with kernel TCP.</w:t>
+        <w:t xml:space="preserve">Making the agent a fairer neighbour by learning rather than by rule: add a competing flow to the training environment and a fairness term to the objective (the polite mode of Section 8.15 is the hand-made version), then test coexistence with kernel TCP.</w:t>
       </w:r>
     </w:p>
     <w:p>

</xml_diff>

<commit_message>
Fairness-aware ES attempt (negative), vt competitor, make repro, report update
Co-Authored-By: Claude Sonnet 5.5 <noreply@anthropic.com>
Claude-Session: https://claude.ai/code/session_01NX2zRNpdVAnzFNKmqomzKu
</commit_message>
<xml_diff>
--- a/docs/RUDP_Final_Project_Report.docx
+++ b/docs/RUDP_Final_Project_Report.docx
@@ -32373,6 +32373,30 @@
           <w:sz w:val="24"/>
           <w:szCs w:val="24"/>
         </w:rPr>
+        <w:t xml:space="preserve">An attempt to learn fairness (negative result).</w:t>
+      </w:r>
+      <w:r>
+        <w:rPr>
+          <w:rFonts w:ascii="Times New Roman" w:cs="Times New Roman" w:eastAsia="Times New Roman" w:hAnsi="Times New Roman"/>
+          <w:sz w:val="24"/>
+          <w:szCs w:val="24"/>
+        </w:rPr>
+        <w:t xml:space="preserve"> The virtual-time sender gained a simulated, always-busy AIMD competitor on the same bottleneck (--vcomp), and the evolution-strategy trainer was given a penalty on taking more than half of the link. Two runs (penalty weight 3 for 60 generations, 12 for 150) were tested on 40 held-out random paths: the agent's mean share stayed at 0.59 to 0.60 (AIMD against the same competitor takes 0.47), and the time ratio to AIMD stayed between 0.52 and 0.56. The rule-based polite mode, which works on real sockets, also barely changes the share in this simulator (0.59 to 0.58), so the simulated competitor does not reproduce the real two-flow behaviour well enough to train against. The original weights were kept (results/es_fair/SUMMARY.txt).</w:t>
+      </w:r>
+    </w:p>
+    <w:p>
+      <w:pPr>
+        <w:spacing w:after="120" w:line="360"/>
+        <w:jc w:val="both"/>
+      </w:pPr>
+      <w:r>
+        <w:rPr>
+          <w:rFonts w:ascii="Times New Roman" w:cs="Times New Roman" w:eastAsia="Times New Roman" w:hAnsi="Times New Roman"/>
+          <w:b/>
+          <w:bCs/>
+          <w:sz w:val="24"/>
+          <w:szCs w:val="24"/>
+        </w:rPr>
         <w:t xml:space="preserve">Multi-client server.</w:t>
       </w:r>
       <w:r>
@@ -39132,7 +39156,7 @@
           <w:sz w:val="24"/>
           <w:szCs w:val="24"/>
         </w:rPr>
-        <w:t xml:space="preserve"> On a shared bottleneck the neural agent takes 68% to 70% of the link against tuned AIMD and 76% against the original AIMD (Sections 8.13 and 8.15). The optional polite mode brings this to about half, at a cost in speed and with one path 2.95 times slower; it is a rule added by hand, not something the agent learned, and coexistence with kernel TCP was not tested.</w:t>
+        <w:t xml:space="preserve"> On a shared bottleneck the neural agent takes 68% to 70% of the link against tuned AIMD and 76% against the original AIMD (Sections 8.13 and 8.15). The optional polite mode brings this to about half, at a cost in speed and with one path 2.95 times slower; it is a rule added by hand (training the agent for fairness against a simulated competitor did not work, Section 8.15), and coexistence with kernel TCP was not tested.</w:t>
       </w:r>
     </w:p>
     <w:p>

</xml_diff>

<commit_message>
Report: cross-traffic training section
Co-Authored-By: Claude Sonnet 5.5 <noreply@anthropic.com>
Claude-Session: https://claude.ai/code/session_01NX2zRNpdVAnzFNKmqomzKu
</commit_message>
<xml_diff>
--- a/docs/RUDP_Final_Project_Report.docx
+++ b/docs/RUDP_Final_Project_Report.docx
@@ -32382,6 +32382,30 @@
           <w:szCs w:val="24"/>
         </w:rPr>
         <w:t xml:space="preserve"> The virtual-time sender gained a simulated, always-busy AIMD competitor on the same bottleneck (--vcomp), and the evolution-strategy trainer was given a penalty on taking more than half of the link. Two runs (penalty weight 3 for 60 generations, 12 for 150) were tested on 40 held-out random paths: the agent's mean share stayed at 0.59 to 0.60 (AIMD against the same competitor takes 0.47), and the time ratio to AIMD stayed between 0.52 and 0.56. The rule-based polite mode, which works on real sockets, also barely changes the share in this simulator (0.59 to 0.58), so the simulated competitor does not reproduce the real two-flow behaviour well enough to train against. The original weights were kept (results/es_fair/SUMMARY.txt).</w:t>
+      </w:r>
+    </w:p>
+    <w:p>
+      <w:pPr>
+        <w:spacing w:after="120" w:line="360"/>
+        <w:jc w:val="both"/>
+      </w:pPr>
+      <w:r>
+        <w:rPr>
+          <w:rFonts w:ascii="Times New Roman" w:cs="Times New Roman" w:eastAsia="Times New Roman" w:hAnsi="Times New Roman"/>
+          <w:b/>
+          <w:bCs/>
+          <w:sz w:val="24"/>
+          <w:szCs w:val="24"/>
+        </w:rPr>
+        <w:t xml:space="preserve">Training with cross traffic.</w:t>
+      </w:r>
+      <w:r>
+        <w:rPr>
+          <w:rFonts w:ascii="Times New Roman" w:cs="Times New Roman" w:eastAsia="Times New Roman" w:hAnsi="Times New Roman"/>
+          <w:sz w:val="24"/>
+          <w:szCs w:val="24"/>
+        </w:rPr>
+        <w:t xml:space="preserve"> The virtual-time sender also gained the same bursty cross traffic (--vcross) and the trainer a mode that puts it on half the training paths. After 150 generations the new weights (results/dqn_cross.txt) reduced the geometric-mean time ratio to tuned AIMD from 0.530 to 0.502 on 60 held-out paths with cross traffic (0.635 to 0.619 on a second set of 60), and on the five named paths they were 12% faster on the lossy path, 3% and 1% faster on two others, and 3% slower on the 5G-like path (retransmissions 4 to 21). On real sockets with cross traffic the mean fell from 4.87 s to 4.53 s over 8 paired runs, but the difference (341 ms, interval of 706 ms) is not significant and retransmissions rose from 200 to 218. It is therefore offered as an option, not made the default, and the cross-traffic limitation above stands.</w:t>
       </w:r>
     </w:p>
     <w:p>

</xml_diff>

<commit_message>
Refactor the sender into librudp with a public API; smart_client is now a thin CLI (34 deterministic results identical); API test, example, make install
Co-Authored-By: Claude Sonnet 5.5 <noreply@anthropic.com>
Claude-Session: https://claude.ai/code/session_01NX2zRNpdVAnzFNKmqomzKu
</commit_message>
<xml_diff>
--- a/docs/RUDP_Final_Project_Report.docx
+++ b/docs/RUDP_Final_Project_Report.docx
@@ -32430,6 +32430,51 @@
           <w:szCs w:val="24"/>
         </w:rPr>
         <w:t xml:space="preserve"> The server keeps one session per client address (up to 16 at once, the least recently active is recycled), so several senders can use one server process; a retransmitted FIN after the connection closed is now acknowledged again. A regression test sends two files from two senders at the same time and checks that both arrive byte-identical (tests/test_multiclient.sh, part of make test).</w:t>
+      </w:r>
+    </w:p>
+    <w:p>
+      <w:pPr>
+        <w:pStyle w:val="Heading2"/>
+        <w:keepNext/>
+        <w:spacing w:after="120" w:before="120" w:line="360"/>
+      </w:pPr>
+      <w:r>
+        <w:rPr>
+          <w:rFonts w:ascii="Times New Roman" w:cs="Times New Roman" w:eastAsia="Times New Roman" w:hAnsi="Times New Roman"/>
+          <w:b/>
+          <w:bCs/>
+          <w:sz w:val="24"/>
+          <w:szCs w:val="24"/>
+        </w:rPr>
+        <w:t xml:space="preserve">8.16 The sender as a library</w:t>
+      </w:r>
+    </w:p>
+    <w:p>
+      <w:pPr>
+        <w:spacing w:after="120" w:line="360"/>
+        <w:jc w:val="both"/>
+      </w:pPr>
+      <w:r>
+        <w:rPr>
+          <w:rFonts w:ascii="Times New Roman" w:cs="Times New Roman" w:eastAsia="Times New Roman" w:hAnsi="Times New Roman"/>
+          <w:sz w:val="24"/>
+          <w:szCs w:val="24"/>
+        </w:rPr>
+        <w:t xml:space="preserve">The sender had grown inside one command-line program. It was refactored into a C library, librudp (src/rudp_sender.c, public header src/rudp.h), with a small API: rudp_options_default, rudp_send (a buffer), rudp_send_file, rudp_send_test_pattern and rudp_strerror, plus option and statistics structures. The command-line program (smart_client) is now a thin front end that fills the options and prints the RESULT line, so every evaluation script works unchanged. The library can be built with make lib, installed with make install, and used as in examples/send_buffer.c.</w:t>
+      </w:r>
+    </w:p>
+    <w:p>
+      <w:pPr>
+        <w:spacing w:after="120" w:line="360"/>
+        <w:jc w:val="both"/>
+      </w:pPr>
+      <w:r>
+        <w:rPr>
+          <w:rFonts w:ascii="Times New Roman" w:cs="Times New Roman" w:eastAsia="Times New Roman" w:hAnsi="Times New Roman"/>
+          <w:sz w:val="24"/>
+          <w:szCs w:val="24"/>
+        </w:rPr>
+        <w:t xml:space="preserve">Because every number in this report comes from that code, the refactor was checked by equivalence: 34 deterministic virtual-time results (the AIMD, CUBIC, neural, polite, table and Go-Back-N policies on two paths with two seeds, plus runs with a competitor and with cross traffic) were recorded before the change and compared after it; all 34 lines are byte-for-byte identical. A new test (tests/test_api.sh) sends two payloads one after the other from one process through the API, with 5% emulated loss, and compares the sender's FNV-1a hash with the server's, which also shows that no state leaks between calls (a stale selective-acknowledgment array would have corrupted the second transfer). Limits: one transfer per call (connect, send, close), at most 32 MB, IPv4 only, and global state, so it is not thread-safe.</w:t>
       </w:r>
     </w:p>
     <w:p>

</xml_diff>